<commit_message>
Finance framing, long sentences, symbols list; cleaner reading copy
- 1.2, 7.2, 5.4 and 3.6 carry the finance frame from FINANCE_FRAMING.md:
  why the wedge matters for value, and why value per dollar of revenue
  and per dollar of commerce diverge when the take rate moves.
- Sentences over 30 words split (the 1.1 ambition and the research
  question kept as written).
- New Symbols and Abbreviations page for the YZU list of symbols.
- Reading copy: bundled Inter (no Type 3 fonts), figures kept with
  captions, short tables kept whole; 56 pages, checked page by page.

Co-Authored-By: Claude Opus 5.5 <noreply@anthropic.com>
Claude-Session: https://claude.ai/code/session_01XxH9J9TaLYfAYFCaGAqS9y
</commit_message>
<xml_diff>
--- a/papers/thesis_2026-10/reading/thesis_editing_copy_2026-10-16.docx
+++ b/papers/thesis_2026-10/reading/thesis_editing_copy_2026-10-16.docx
@@ -114,7 +114,7 @@
         <w:pStyle w:val="BodyText"/>
       </w:pPr>
       <w:r>
-        <w:t xml:space="preserve">Revenue shows only a small part of the commerce. In 2023, three major platforms in Indonesia kept about US$3 billion of the US$43 billion that passed through them. Revenue also stopped tracking the commerce when platforms changed the share of each sale they kept. Between 2022 and 2024, Indonesian and regional platforms changed that share about three times as much as 27 platforms abroad, so the hypothesis that revenue grows in proportion to the commerce is rejected.</w:t>
+        <w:t xml:space="preserve">Revenue shows only a small part of the commerce. In 2023, three major platforms in Indonesia kept about US$3 billion of the US$43 billion that passed through them. Revenue also stopped tracking the commerce when platforms changed the share of each sale they kept. Between 2022 and 2024, Indonesian and regional platforms changed that share about three times as much as 27 platforms abroad. So the hypothesis that revenue grows in proportion to the commerce is rejected.</w:t>
       </w:r>
     </w:p>
     <w:p>
@@ -164,12 +164,911 @@
       </w:r>
     </w:p>
     <w:bookmarkEnd w:id="20"/>
-    <w:bookmarkStart w:id="24" w:name="chapter-1.-introduction"/>
+    <w:bookmarkStart w:id="21" w:name="symbols-and-abbreviations"/>
     <w:p>
       <w:pPr>
         <w:pStyle w:val="Heading1"/>
       </w:pPr>
       <w:r>
+        <w:t xml:space="preserve">Symbols and Abbreviations</w:t>
+      </w:r>
+    </w:p>
+    <w:p>
+      <w:pPr>
+        <w:pStyle w:val="FirstParagraph"/>
+      </w:pPr>
+      <w:r>
+        <w:t xml:space="preserve">Each symbol is defined in Chapter 3, where it first appears in a formula. The subscripts i and t mark the platform and the year.</w:t>
+      </w:r>
+    </w:p>
+    <w:tbl>
+      <w:tblPr>
+        <w:tblStyle w:val="Table"/>
+        <w:tblW w:type="pct" w:w="5000"/>
+        <w:tblLook w:firstRow="1" w:lastRow="0" w:firstColumn="0" w:lastColumn="0" w:noHBand="0" w:noVBand="0" w:val="0020"/>
+        <w:jc w:val="start"/>
+      </w:tblPr>
+      <w:tblGrid>
+        <w:gridCol w:w="2640"/>
+        <w:gridCol w:w="2640"/>
+        <w:gridCol w:w="2640"/>
+      </w:tblGrid>
+      <w:tr>
+        <w:trPr>
+          <w:tblHeader w:val="true"/>
+        </w:trPr>
+        <w:tc>
+          <w:tcPr/>
+          <w:p>
+            <w:pPr>
+              <w:pStyle w:val="Compact"/>
+              <w:jc w:val="left"/>
+            </w:pPr>
+            <w:r>
+              <w:t xml:space="preserve">Symbol</w:t>
+            </w:r>
+          </w:p>
+        </w:tc>
+        <w:tc>
+          <w:tcPr/>
+          <w:p>
+            <w:pPr>
+              <w:pStyle w:val="Compact"/>
+              <w:jc w:val="left"/>
+            </w:pPr>
+            <w:r>
+              <w:t xml:space="preserve">Meaning</w:t>
+            </w:r>
+          </w:p>
+        </w:tc>
+        <w:tc>
+          <w:tcPr/>
+          <w:p>
+            <w:pPr>
+              <w:pStyle w:val="Compact"/>
+              <w:jc w:val="left"/>
+            </w:pPr>
+            <w:r>
+              <w:t xml:space="preserve">First defined</w:t>
+            </w:r>
+          </w:p>
+        </w:tc>
+      </w:tr>
+      <w:tr>
+        <w:tc>
+          <w:tcPr/>
+          <w:p>
+            <w:pPr>
+              <w:pStyle w:val="Compact"/>
+              <w:jc w:val="left"/>
+            </w:pPr>
+            <w:r>
+              <w:t xml:space="preserve">V</w:t>
+            </w:r>
+          </w:p>
+        </w:tc>
+        <w:tc>
+          <w:tcPr/>
+          <w:p>
+            <w:pPr>
+              <w:pStyle w:val="Compact"/>
+              <w:jc w:val="left"/>
+            </w:pPr>
+            <w:r>
+              <w:t xml:space="preserve">Transaction value: everything bought through a platform in a period</w:t>
+            </w:r>
+          </w:p>
+        </w:tc>
+        <w:tc>
+          <w:tcPr/>
+          <w:p>
+            <w:pPr>
+              <w:pStyle w:val="Compact"/>
+              <w:jc w:val="left"/>
+            </w:pPr>
+            <w:r>
+              <w:t xml:space="preserve">Table 3.1</w:t>
+            </w:r>
+          </w:p>
+        </w:tc>
+      </w:tr>
+      <w:tr>
+        <w:tc>
+          <w:tcPr/>
+          <w:p>
+            <w:pPr>
+              <w:pStyle w:val="Compact"/>
+              <w:jc w:val="left"/>
+            </w:pPr>
+            <w:r>
+              <w:t xml:space="preserve">R</w:t>
+            </w:r>
+          </w:p>
+        </w:tc>
+        <w:tc>
+          <w:tcPr/>
+          <w:p>
+            <w:pPr>
+              <w:pStyle w:val="Compact"/>
+              <w:jc w:val="left"/>
+            </w:pPr>
+            <w:r>
+              <w:t xml:space="preserve">Revenue: what the platform records as its own income</w:t>
+            </w:r>
+          </w:p>
+        </w:tc>
+        <w:tc>
+          <w:tcPr/>
+          <w:p>
+            <w:pPr>
+              <w:pStyle w:val="Compact"/>
+              <w:jc w:val="left"/>
+            </w:pPr>
+            <w:r>
+              <w:t xml:space="preserve">Table 3.1</w:t>
+            </w:r>
+          </w:p>
+        </w:tc>
+      </w:tr>
+      <w:tr>
+        <w:tc>
+          <w:tcPr/>
+          <w:p>
+            <w:pPr>
+              <w:pStyle w:val="Compact"/>
+              <w:jc w:val="left"/>
+            </w:pPr>
+            <w:r>
+              <w:t xml:space="preserve">m</w:t>
+            </w:r>
+          </w:p>
+        </w:tc>
+        <w:tc>
+          <w:tcPr/>
+          <w:p>
+            <w:pPr>
+              <w:pStyle w:val="Compact"/>
+              <w:jc w:val="left"/>
+            </w:pPr>
+            <w:r>
+              <w:t xml:space="preserve">Take rate, R divided by V: the share of each sale the platform keeps</w:t>
+            </w:r>
+          </w:p>
+        </w:tc>
+        <w:tc>
+          <w:tcPr/>
+          <w:p>
+            <w:pPr>
+              <w:pStyle w:val="Compact"/>
+              <w:jc w:val="left"/>
+            </w:pPr>
+            <w:r>
+              <w:t xml:space="preserve">Table 3.1</w:t>
+            </w:r>
+          </w:p>
+        </w:tc>
+      </w:tr>
+      <w:tr>
+        <w:tc>
+          <w:tcPr/>
+          <w:p>
+            <w:pPr>
+              <w:pStyle w:val="Compact"/>
+              <w:jc w:val="left"/>
+            </w:pPr>
+            <w:r>
+              <w:t xml:space="preserve">f</w:t>
+            </w:r>
+          </w:p>
+        </w:tc>
+        <w:tc>
+          <w:tcPr/>
+          <w:p>
+            <w:pPr>
+              <w:pStyle w:val="Compact"/>
+              <w:jc w:val="left"/>
+            </w:pPr>
+            <w:r>
+              <w:t xml:space="preserve">Fee rate: revenue before customer incentives, divided by V</w:t>
+            </w:r>
+          </w:p>
+        </w:tc>
+        <w:tc>
+          <w:tcPr/>
+          <w:p>
+            <w:pPr>
+              <w:pStyle w:val="Compact"/>
+              <w:jc w:val="left"/>
+            </w:pPr>
+            <w:r>
+              <w:t xml:space="preserve">Table 3.1</w:t>
+            </w:r>
+          </w:p>
+        </w:tc>
+      </w:tr>
+      <w:tr>
+        <w:tc>
+          <w:tcPr/>
+          <w:p>
+            <w:pPr>
+              <w:pStyle w:val="Compact"/>
+              <w:jc w:val="left"/>
+            </w:pPr>
+            <w:r>
+              <w:t xml:space="preserve">s</w:t>
+            </w:r>
+          </w:p>
+        </w:tc>
+        <w:tc>
+          <w:tcPr/>
+          <w:p>
+            <w:pPr>
+              <w:pStyle w:val="Compact"/>
+              <w:jc w:val="left"/>
+            </w:pPr>
+            <w:r>
+              <w:t xml:space="preserve">Incentive rate: customer incentives divided by V</w:t>
+            </w:r>
+          </w:p>
+        </w:tc>
+        <w:tc>
+          <w:tcPr/>
+          <w:p>
+            <w:pPr>
+              <w:pStyle w:val="Compact"/>
+              <w:jc w:val="left"/>
+            </w:pPr>
+            <w:r>
+              <w:t xml:space="preserve">Table 3.1</w:t>
+            </w:r>
+          </w:p>
+        </w:tc>
+      </w:tr>
+      <w:tr>
+        <w:tc>
+          <w:tcPr/>
+          <w:p>
+            <w:pPr>
+              <w:pStyle w:val="Compact"/>
+              <w:jc w:val="left"/>
+            </w:pPr>
+            <w:r>
+              <w:t xml:space="preserve">W</w:t>
+            </w:r>
+          </w:p>
+        </w:tc>
+        <w:tc>
+          <w:tcPr/>
+          <w:p>
+            <w:pPr>
+              <w:pStyle w:val="Compact"/>
+              <w:jc w:val="left"/>
+            </w:pPr>
+            <w:r>
+              <w:t xml:space="preserve">Invisible wedge, V minus R: what a revenue figure leaves out</w:t>
+            </w:r>
+          </w:p>
+        </w:tc>
+        <w:tc>
+          <w:tcPr/>
+          <w:p>
+            <w:pPr>
+              <w:pStyle w:val="Compact"/>
+              <w:jc w:val="left"/>
+            </w:pPr>
+            <w:r>
+              <w:t xml:space="preserve">Equation (1)</w:t>
+            </w:r>
+          </w:p>
+        </w:tc>
+      </w:tr>
+      <w:tr>
+        <w:tc>
+          <w:tcPr/>
+          <w:p>
+            <w:pPr>
+              <w:pStyle w:val="Compact"/>
+              <w:jc w:val="left"/>
+            </w:pPr>
+            <w:r>
+              <w:t xml:space="preserve">E</w:t>
+            </w:r>
+          </w:p>
+        </w:tc>
+        <w:tc>
+          <w:tcPr/>
+          <w:p>
+            <w:pPr>
+              <w:pStyle w:val="Compact"/>
+              <w:jc w:val="left"/>
+            </w:pPr>
+            <w:r>
+              <w:t xml:space="preserve">Ecosystem ratio, W divided by R, equal to 1/m − 1 (the author’s own measure)</w:t>
+            </w:r>
+          </w:p>
+        </w:tc>
+        <w:tc>
+          <w:tcPr/>
+          <w:p>
+            <w:pPr>
+              <w:pStyle w:val="Compact"/>
+              <w:jc w:val="left"/>
+            </w:pPr>
+            <w:r>
+              <w:t xml:space="preserve">Equation (2)</w:t>
+            </w:r>
+          </w:p>
+        </w:tc>
+      </w:tr>
+      <w:tr>
+        <w:tc>
+          <w:tcPr/>
+          <w:p>
+            <w:pPr>
+              <w:pStyle w:val="Compact"/>
+              <w:jc w:val="left"/>
+            </w:pPr>
+            <w:r>
+              <w:t xml:space="preserve">g(·)</w:t>
+            </w:r>
+          </w:p>
+        </w:tc>
+        <w:tc>
+          <w:tcPr/>
+          <w:p>
+            <w:pPr>
+              <w:pStyle w:val="Compact"/>
+              <w:jc w:val="left"/>
+            </w:pPr>
+            <w:r>
+              <w:t xml:space="preserve">Growth from one year to the next, as a share of the first year</w:t>
+            </w:r>
+          </w:p>
+        </w:tc>
+        <w:tc>
+          <w:tcPr/>
+          <w:p>
+            <w:pPr>
+              <w:pStyle w:val="Compact"/>
+              <w:jc w:val="left"/>
+            </w:pPr>
+            <w:r>
+              <w:t xml:space="preserve">Table 3.1</w:t>
+            </w:r>
+          </w:p>
+        </w:tc>
+      </w:tr>
+      <w:tr>
+        <w:tc>
+          <w:tcPr/>
+          <w:p>
+            <w:pPr>
+              <w:pStyle w:val="Compact"/>
+              <w:jc w:val="left"/>
+            </w:pPr>
+            <w:r>
+              <w:t xml:space="preserve">D</w:t>
+            </w:r>
+          </w:p>
+        </w:tc>
+        <w:tc>
+          <w:tcPr/>
+          <w:p>
+            <w:pPr>
+              <w:pStyle w:val="Compact"/>
+              <w:jc w:val="left"/>
+            </w:pPr>
+            <w:r>
+              <w:t xml:space="preserve">Growth divergence, g(R) minus g(V)</w:t>
+            </w:r>
+          </w:p>
+        </w:tc>
+        <w:tc>
+          <w:tcPr/>
+          <w:p>
+            <w:pPr>
+              <w:pStyle w:val="Compact"/>
+              <w:jc w:val="left"/>
+            </w:pPr>
+            <w:r>
+              <w:t xml:space="preserve">Equation (3)</w:t>
+            </w:r>
+          </w:p>
+        </w:tc>
+      </w:tr>
+      <w:tr>
+        <w:tc>
+          <w:tcPr/>
+          <w:p>
+            <w:pPr>
+              <w:pStyle w:val="Compact"/>
+              <w:jc w:val="left"/>
+            </w:pPr>
+            <w:r>
+              <w:t xml:space="preserve">Δln X</w:t>
+            </w:r>
+          </w:p>
+        </w:tc>
+        <w:tc>
+          <w:tcPr/>
+          <w:p>
+            <w:pPr>
+              <w:pStyle w:val="Compact"/>
+              <w:jc w:val="left"/>
+            </w:pPr>
+            <w:r>
+              <w:t xml:space="preserve">Change in the natural logarithm of X from one year to the next</w:t>
+            </w:r>
+          </w:p>
+        </w:tc>
+        <w:tc>
+          <w:tcPr/>
+          <w:p>
+            <w:pPr>
+              <w:pStyle w:val="Compact"/>
+              <w:jc w:val="left"/>
+            </w:pPr>
+            <w:r>
+              <w:t xml:space="preserve">Equation (5)</w:t>
+            </w:r>
+          </w:p>
+        </w:tc>
+      </w:tr>
+      <w:tr>
+        <w:tc>
+          <w:tcPr/>
+          <w:p>
+            <w:pPr>
+              <w:pStyle w:val="Compact"/>
+              <w:jc w:val="left"/>
+            </w:pPr>
+            <w:r>
+              <w:t xml:space="preserve">N</w:t>
+            </w:r>
+          </w:p>
+        </w:tc>
+        <w:tc>
+          <w:tcPr/>
+          <w:p>
+            <w:pPr>
+              <w:pStyle w:val="Compact"/>
+              <w:jc w:val="left"/>
+            </w:pPr>
+            <w:r>
+              <w:t xml:space="preserve">BPS’s count of businesses selling online</w:t>
+            </w:r>
+          </w:p>
+        </w:tc>
+        <w:tc>
+          <w:tcPr/>
+          <w:p>
+            <w:pPr>
+              <w:pStyle w:val="Compact"/>
+              <w:jc w:val="left"/>
+            </w:pPr>
+            <w:r>
+              <w:t xml:space="preserve">Equation (7)</w:t>
+            </w:r>
+          </w:p>
+        </w:tc>
+      </w:tr>
+      <w:tr>
+        <w:tc>
+          <w:tcPr/>
+          <w:p>
+            <w:pPr>
+              <w:pStyle w:val="Compact"/>
+              <w:jc w:val="left"/>
+            </w:pPr>
+            <w:r>
+              <w:t xml:space="preserve">Y</w:t>
+            </w:r>
+          </w:p>
+        </w:tc>
+        <w:tc>
+          <w:tcPr/>
+          <w:p>
+            <w:pPr>
+              <w:pStyle w:val="Compact"/>
+              <w:jc w:val="left"/>
+            </w:pPr>
+            <w:r>
+              <w:t xml:space="preserve">BPS’s total online sales value</w:t>
+            </w:r>
+          </w:p>
+        </w:tc>
+        <w:tc>
+          <w:tcPr/>
+          <w:p>
+            <w:pPr>
+              <w:pStyle w:val="Compact"/>
+              <w:jc w:val="left"/>
+            </w:pPr>
+            <w:r>
+              <w:t xml:space="preserve">Equation (7)</w:t>
+            </w:r>
+          </w:p>
+        </w:tc>
+      </w:tr>
+      <w:tr>
+        <w:tc>
+          <w:tcPr/>
+          <w:p>
+            <w:pPr>
+              <w:pStyle w:val="Compact"/>
+              <w:jc w:val="left"/>
+            </w:pPr>
+            <w:r>
+              <w:t xml:space="preserve">MV</w:t>
+            </w:r>
+          </w:p>
+        </w:tc>
+        <w:tc>
+          <w:tcPr/>
+          <w:p>
+            <w:pPr>
+              <w:pStyle w:val="Compact"/>
+              <w:jc w:val="left"/>
+            </w:pPr>
+            <w:r>
+              <w:t xml:space="preserve">A listed platform’s market value</w:t>
+            </w:r>
+          </w:p>
+        </w:tc>
+        <w:tc>
+          <w:tcPr/>
+          <w:p>
+            <w:pPr>
+              <w:pStyle w:val="Compact"/>
+              <w:jc w:val="left"/>
+            </w:pPr>
+            <w:r>
+              <w:t xml:space="preserve">Equation (8)</w:t>
+            </w:r>
+          </w:p>
+        </w:tc>
+      </w:tr>
+      <w:tr>
+        <w:tc>
+          <w:tcPr/>
+          <w:p>
+            <w:pPr>
+              <w:pStyle w:val="Compact"/>
+              <w:jc w:val="left"/>
+            </w:pPr>
+            <w:r>
+              <w:t xml:space="preserve">β_V, β_m</w:t>
+            </w:r>
+          </w:p>
+        </w:tc>
+        <w:tc>
+          <w:tcPr/>
+          <w:p>
+            <w:pPr>
+              <w:pStyle w:val="Compact"/>
+              <w:jc w:val="left"/>
+            </w:pPr>
+            <w:r>
+              <w:t xml:space="preserve">How market value moves with transaction value and with the take rate</w:t>
+            </w:r>
+          </w:p>
+        </w:tc>
+        <w:tc>
+          <w:tcPr/>
+          <w:p>
+            <w:pPr>
+              <w:pStyle w:val="Compact"/>
+              <w:jc w:val="left"/>
+            </w:pPr>
+            <w:r>
+              <w:t xml:space="preserve">Equation (8)</w:t>
+            </w:r>
+          </w:p>
+        </w:tc>
+      </w:tr>
+      <w:tr>
+        <w:tc>
+          <w:tcPr/>
+          <w:p>
+            <w:pPr>
+              <w:pStyle w:val="Compact"/>
+              <w:jc w:val="left"/>
+            </w:pPr>
+            <w:r>
+              <w:t xml:space="preserve">H1, H2</w:t>
+            </w:r>
+          </w:p>
+        </w:tc>
+        <w:tc>
+          <w:tcPr/>
+          <w:p>
+            <w:pPr>
+              <w:pStyle w:val="Compact"/>
+              <w:jc w:val="left"/>
+            </w:pPr>
+            <w:r>
+              <w:t xml:space="preserve">The two hypotheses</w:t>
+            </w:r>
+          </w:p>
+        </w:tc>
+        <w:tc>
+          <w:tcPr/>
+          <w:p>
+            <w:pPr>
+              <w:pStyle w:val="Compact"/>
+              <w:jc w:val="left"/>
+            </w:pPr>
+            <w:r>
+              <w:t xml:space="preserve">Section 3.4</w:t>
+            </w:r>
+          </w:p>
+        </w:tc>
+      </w:tr>
+    </w:tbl>
+    <w:p>
+      <w:pPr>
+        <w:pStyle w:val="BodyText"/>
+      </w:pPr>
+      <w:r>
+        <w:t xml:space="preserve">The text spells out most names. These abbreviations remain.</w:t>
+      </w:r>
+    </w:p>
+    <w:tbl>
+      <w:tblPr>
+        <w:tblStyle w:val="Table"/>
+        <w:tblW w:type="pct" w:w="5000"/>
+        <w:tblLook w:firstRow="1" w:lastRow="0" w:firstColumn="0" w:lastColumn="0" w:noHBand="0" w:noVBand="0" w:val="0020"/>
+        <w:jc w:val="start"/>
+      </w:tblPr>
+      <w:tblGrid>
+        <w:gridCol w:w="3960"/>
+        <w:gridCol w:w="3960"/>
+      </w:tblGrid>
+      <w:tr>
+        <w:trPr>
+          <w:tblHeader w:val="true"/>
+        </w:trPr>
+        <w:tc>
+          <w:tcPr/>
+          <w:p>
+            <w:pPr>
+              <w:pStyle w:val="Compact"/>
+              <w:jc w:val="left"/>
+            </w:pPr>
+            <w:r>
+              <w:t xml:space="preserve">Abbreviation</w:t>
+            </w:r>
+          </w:p>
+        </w:tc>
+        <w:tc>
+          <w:tcPr/>
+          <w:p>
+            <w:pPr>
+              <w:pStyle w:val="Compact"/>
+              <w:jc w:val="left"/>
+            </w:pPr>
+            <w:r>
+              <w:t xml:space="preserve">Meaning</w:t>
+            </w:r>
+          </w:p>
+        </w:tc>
+      </w:tr>
+      <w:tr>
+        <w:tc>
+          <w:tcPr/>
+          <w:p>
+            <w:pPr>
+              <w:pStyle w:val="Compact"/>
+              <w:jc w:val="left"/>
+            </w:pPr>
+            <w:r>
+              <w:t xml:space="preserve">BPS</w:t>
+            </w:r>
+          </w:p>
+        </w:tc>
+        <w:tc>
+          <w:tcPr/>
+          <w:p>
+            <w:pPr>
+              <w:pStyle w:val="Compact"/>
+              <w:jc w:val="left"/>
+            </w:pPr>
+            <w:r>
+              <w:t xml:space="preserve">Badan Pusat Statistik, Statistics Indonesia</w:t>
+            </w:r>
+          </w:p>
+        </w:tc>
+      </w:tr>
+      <w:tr>
+        <w:tc>
+          <w:tcPr/>
+          <w:p>
+            <w:pPr>
+              <w:pStyle w:val="Compact"/>
+              <w:jc w:val="left"/>
+            </w:pPr>
+            <w:r>
+              <w:t xml:space="preserve">GMV, GTV, TPV</w:t>
+            </w:r>
+          </w:p>
+        </w:tc>
+        <w:tc>
+          <w:tcPr/>
+          <w:p>
+            <w:pPr>
+              <w:pStyle w:val="Compact"/>
+              <w:jc w:val="left"/>
+            </w:pPr>
+            <w:r>
+              <w:t xml:space="preserve">Gross merchandise value, gross transaction value, total payment volume: company names for transaction value</w:t>
+            </w:r>
+          </w:p>
+        </w:tc>
+      </w:tr>
+      <w:tr>
+        <w:tc>
+          <w:tcPr/>
+          <w:p>
+            <w:pPr>
+              <w:pStyle w:val="Compact"/>
+              <w:jc w:val="left"/>
+            </w:pPr>
+            <w:r>
+              <w:t xml:space="preserve">IASB, IFRS 15</w:t>
+            </w:r>
+          </w:p>
+        </w:tc>
+        <w:tc>
+          <w:tcPr/>
+          <w:p>
+            <w:pPr>
+              <w:pStyle w:val="Compact"/>
+              <w:jc w:val="left"/>
+            </w:pPr>
+            <w:r>
+              <w:t xml:space="preserve">International Accounting Standards Board; International Financial Reporting Standard 15, its revenue standard</w:t>
+            </w:r>
+          </w:p>
+        </w:tc>
+      </w:tr>
+      <w:tr>
+        <w:tc>
+          <w:tcPr/>
+          <w:p>
+            <w:pPr>
+              <w:pStyle w:val="Compact"/>
+              <w:jc w:val="left"/>
+            </w:pPr>
+            <w:r>
+              <w:t xml:space="preserve">LSEG</w:t>
+            </w:r>
+          </w:p>
+        </w:tc>
+        <w:tc>
+          <w:tcPr/>
+          <w:p>
+            <w:pPr>
+              <w:pStyle w:val="Compact"/>
+              <w:jc w:val="left"/>
+            </w:pPr>
+            <w:r>
+              <w:t xml:space="preserve">London Stock Exchange Group, the source of market values</w:t>
+            </w:r>
+          </w:p>
+        </w:tc>
+      </w:tr>
+      <w:tr>
+        <w:tc>
+          <w:tcPr/>
+          <w:p>
+            <w:pPr>
+              <w:pStyle w:val="Compact"/>
+              <w:jc w:val="left"/>
+            </w:pPr>
+            <w:r>
+              <w:t xml:space="preserve">OECD</w:t>
+            </w:r>
+          </w:p>
+        </w:tc>
+        <w:tc>
+          <w:tcPr/>
+          <w:p>
+            <w:pPr>
+              <w:pStyle w:val="Compact"/>
+              <w:jc w:val="left"/>
+            </w:pPr>
+            <w:r>
+              <w:t xml:space="preserve">Organisation for Economic Co-operation and Development</w:t>
+            </w:r>
+          </w:p>
+        </w:tc>
+      </w:tr>
+      <w:tr>
+        <w:tc>
+          <w:tcPr/>
+          <w:p>
+            <w:pPr>
+              <w:pStyle w:val="Compact"/>
+              <w:jc w:val="left"/>
+            </w:pPr>
+            <w:r>
+              <w:t xml:space="preserve">QRIS</w:t>
+            </w:r>
+          </w:p>
+        </w:tc>
+        <w:tc>
+          <w:tcPr/>
+          <w:p>
+            <w:pPr>
+              <w:pStyle w:val="Compact"/>
+              <w:jc w:val="left"/>
+            </w:pPr>
+            <w:r>
+              <w:t xml:space="preserve">Quick Response Code Indonesian Standard, the national QR-code payment system</w:t>
+            </w:r>
+          </w:p>
+        </w:tc>
+      </w:tr>
+      <w:tr>
+        <w:tc>
+          <w:tcPr/>
+          <w:p>
+            <w:pPr>
+              <w:pStyle w:val="Compact"/>
+              <w:jc w:val="left"/>
+            </w:pPr>
+            <w:r>
+              <w:t xml:space="preserve">UNCTAD</w:t>
+            </w:r>
+          </w:p>
+        </w:tc>
+        <w:tc>
+          <w:tcPr/>
+          <w:p>
+            <w:pPr>
+              <w:pStyle w:val="Compact"/>
+              <w:jc w:val="left"/>
+            </w:pPr>
+            <w:r>
+              <w:t xml:space="preserve">United Nations Conference on Trade and Development</w:t>
+            </w:r>
+          </w:p>
+        </w:tc>
+      </w:tr>
+      <w:tr>
+        <w:tc>
+          <w:tcPr/>
+          <w:p>
+            <w:pPr>
+              <w:pStyle w:val="Compact"/>
+              <w:jc w:val="left"/>
+            </w:pPr>
+            <w:r>
+              <w:t xml:space="preserve">Rp, US$</w:t>
+            </w:r>
+          </w:p>
+        </w:tc>
+        <w:tc>
+          <w:tcPr/>
+          <w:p>
+            <w:pPr>
+              <w:pStyle w:val="Compact"/>
+              <w:jc w:val="left"/>
+            </w:pPr>
+            <w:r>
+              <w:t xml:space="preserve">Indonesian rupiah, US dollar</w:t>
+            </w:r>
+          </w:p>
+        </w:tc>
+      </w:tr>
+    </w:tbl>
+    <w:bookmarkEnd w:id="21"/>
+    <w:bookmarkStart w:id="25" w:name="chapter-1.-introduction"/>
+    <w:p>
+      <w:pPr>
+        <w:pStyle w:val="Heading1"/>
+      </w:pPr>
+      <w:r>
         <w:t xml:space="preserve">Chapter 1. Introduction</w:t>
       </w:r>
     </w:p>
@@ -229,7 +1128,7 @@
         <w:t xml:space="preserve">In Indonesia, several platforms report revenue and transaction value each year, and BPS asks online sellers when they began and how their sales changed. The stakes are concrete. For 2024, BPS gives about US$81 billion for online sales and the central bank about US$31 billion, more than two to one (BPS 2025b; Bank Indonesia 2025). The government has set new rules on platform commissions, discounts and tax. Its tax on marketplace sellers can raise about US$60 million a year on one measure of the market and about US$300 million on another, before exemptions (Ministry of Finance of the Republic of Indonesia 2025; author’s calculation). Most online sellers work through messaging and social media, outside the marketplaces, so platform and survey figures are likely to part. The events of 2023 suggest that they did.</w:t>
       </w:r>
     </w:p>
-    <w:bookmarkStart w:id="21" w:name="research-question-and-objectives"/>
+    <w:bookmarkStart w:id="22" w:name="research-question-and-objectives"/>
     <w:p>
       <w:pPr>
         <w:pStyle w:val="Heading2"/>
@@ -278,8 +1177,8 @@
         <w:t xml:space="preserve">In brief, revenue shows only a small part of the commerce that platforms carry. In BPS’s survey, the marketplaces carry only about a fifth of online sales value. In Indonesia, platform revenue also grew faster than the commerce behind it, mainly because platforms kept a larger share of each sale and not because buyers bought more. National growth came mainly from more sellers, as H2 states, but about half of the 2023 rise in the count of sellers is not explained by first-time entry.</w:t>
       </w:r>
     </w:p>
-    <w:bookmarkEnd w:id="21"/>
-    <w:bookmarkStart w:id="22" w:name="contributions"/>
+    <w:bookmarkEnd w:id="22"/>
+    <w:bookmarkStart w:id="23" w:name="contributions"/>
     <w:p>
       <w:pPr>
         <w:pStyle w:val="Heading2"/>
@@ -301,7 +1200,7 @@
         <w:pStyle w:val="BodyText"/>
       </w:pPr>
       <w:r>
-        <w:t xml:space="preserve">For those who value platforms, the thesis shows how small a part of the commerce a platform’s revenue records. It shows why this matters for growth as well as scale: the larger the wedge is next to revenue, the more a small change in fees or discounts moves revenue growth. It also traces why revenue moved, which gives investors a check on whether reported growth came from more commerce or from a larger share of each sale. A prediction registered in advance then tests how market value moves with each of the two.</w:t>
+        <w:t xml:space="preserve">For those who value platforms, the thesis shows how small a part of the commerce a platform’s revenue records. This matters because market values of internet firms track revenue (Bowen, Davis and Rajgopal 2002). It matters for growth as well as scale: the larger the wedge is next to revenue, the more a small change in fees or discounts moves revenue growth. When the take rate moves, market value per dollar of revenue and market value per dollar of commerce change by different amounts. The thesis also traces why revenue moved, which gives investors a check on whether reported growth came from more commerce or from a larger share of each sale. A prediction registered in advance then tests how market value moves with each of the two.</w:t>
       </w:r>
     </w:p>
     <w:p>
@@ -325,11 +1224,11 @@
         <w:pStyle w:val="BodyText"/>
       </w:pPr>
       <w:r>
-        <w:t xml:space="preserve">Earlier work has already compared platform transaction values with national e-commerce statistics. The contribution of this thesis is connected evidence for one country. It draws on the platforms’ accounts, the sellers’ own survey responses and the rules that act on those figures. Across all three, one point recurs: a figure can stop tracking the activity it stands for when the link between them changes, through a platform’s take rate or a survey’s reach.</w:t>
-      </w:r>
-    </w:p>
-    <w:bookmarkEnd w:id="22"/>
-    <w:bookmarkStart w:id="23" w:name="structure-of-the-thesis"/>
+        <w:t xml:space="preserve">Earlier work has already compared platform transaction values with national e-commerce statistics. The contribution of this thesis is connected evidence for one country. It draws on the platforms’ accounts, the sellers’ own survey responses and the rules that act on those figures. Across all three, one point recurs. A figure can stop tracking the activity it stands for when the link between them changes, through a platform’s take rate or a survey’s reach.</w:t>
+      </w:r>
+    </w:p>
+    <w:bookmarkEnd w:id="23"/>
+    <w:bookmarkStart w:id="24" w:name="structure-of-the-thesis"/>
     <w:p>
       <w:pPr>
         <w:pStyle w:val="Heading2"/>
@@ -346,9 +1245,9 @@
         <w:t xml:space="preserve">The thesis moves from ideas to evidence and then to what follows from it. Chapter 2 reviews why platform revenue differs from the commerce behind it, how online selling is measured, and what platform records can show. It ends with the questions the literature leaves open. Chapter 3 turns those questions into measures, two hypotheses, the entry test and four further analyses. Chapter 4 describes the data, which come from platform reports, BPS survey files and national and market figures, and the tests that use them. Chapter 5 gives the results, first for the platforms and then for the national figures. Chapter 6 asks how far Indonesia’s recent rules reach and what the findings mean for other countries. Chapter 7 concludes and states the limits of the evidence.</w:t>
       </w:r>
     </w:p>
-    <w:bookmarkEnd w:id="23"/>
     <w:bookmarkEnd w:id="24"/>
-    <w:bookmarkStart w:id="29" w:name="chapter-2.-literature-review"/>
+    <w:bookmarkEnd w:id="25"/>
+    <w:bookmarkStart w:id="30" w:name="chapter-2.-literature-review"/>
     <w:p>
       <w:pPr>
         <w:pStyle w:val="Heading1"/>
@@ -365,7 +1264,7 @@
         <w:t xml:space="preserve">Digital platforms sit between economic activity and the figures used to measure it. A platform carries a sale between a buyer and a seller. It records part of the payment as its own revenue, and it keeps a record of the whole sale. Different bodies of research study these steps. Platform economics and accounting explain why revenue is only part of each payment (Section 2.1). Official statistics explain how online sales across the country are measured (Section 2.2). Research on third-party information explains what a platform’s records can show to tax authorities (Section 2.3). Each body of research explains why the figures differ, but none measures how far they differ in practice. Section 2.4 sets out this research gap.</w:t>
       </w:r>
     </w:p>
-    <w:bookmarkStart w:id="25" w:name="X2419545b11582f22f334485db35f4409c183a23"/>
+    <w:bookmarkStart w:id="26" w:name="X2419545b11582f22f334485db35f4409c183a23"/>
     <w:p>
       <w:pPr>
         <w:pStyle w:val="Heading2"/>
@@ -406,8 +1305,8 @@
         <w:t xml:space="preserve">Platform economics and accounting explain why the share is small and why it can move, but they leave its actual size and movement to be measured. The pricing models were built to explain how a platform sets its charges, so they predict the direction of a change, not its size in a given market. The accounting studies asked how internet firms around 2000 chose to report revenue, not how far that revenue drifted from the commerce behind it (Bowen, Davis and Rajgopal 2002). Studies of how investors valued those firms, and how analysts forecast their revenue, relied on web traffic as their measure of activity (Trueman, Wong and Zhang 2000, 2001; Rajgopal, Venkatachalam and Kotha 2003). Transaction value also needs care, because each company defines it for itself. A figure of this kind loses information when its definition changes (Givoly, Li, Lourie and Nekrasov 2019). Testing whether revenue stays a fair guide needs the reported revenue and transaction value of the same platforms, over several years and on one definition. The studies reviewed here do not make that comparison, and none covers Indonesian platforms.</w:t>
       </w:r>
     </w:p>
-    <w:bookmarkEnd w:id="25"/>
-    <w:bookmarkStart w:id="26" w:name="measuring-the-digital-economy"/>
+    <w:bookmarkEnd w:id="26"/>
+    <w:bookmarkStart w:id="27" w:name="measuring-the-digital-economy"/>
     <w:p>
       <w:pPr>
         <w:pStyle w:val="Heading2"/>
@@ -448,8 +1347,8 @@
         <w:t xml:space="preserve">The growth split has its own difficulty, because it rests on a count of sellers. Such counts can mislead for known reasons. A change in survey design can create a break that looks like real change (van den Brakel, Smith and Compton 2008; van den Brakel, Zhang and Tam 2020). People tend to report past events as more recent than they were (Neter and Waksberg 1964). Small firms that stop are more often young firms with young owners (McKenzie and Paffhausen 2019). Published totals cannot show whether a rise in the count reflects new sellers or a wider survey, because they do not record when each seller began. That question needs the answers of the sellers themselves.</w:t>
       </w:r>
     </w:p>
-    <w:bookmarkEnd w:id="26"/>
-    <w:bookmarkStart w:id="27" w:name="X3ee77a008a85c18fceb22937f1808424e318f12"/>
+    <w:bookmarkEnd w:id="27"/>
+    <w:bookmarkStart w:id="28" w:name="X3ee77a008a85c18fceb22937f1808424e318f12"/>
     <w:p>
       <w:pPr>
         <w:pStyle w:val="Heading2"/>
@@ -482,8 +1381,8 @@
         <w:t xml:space="preserve">Tax research shows that platform records are valuable where they exist. Its evidence comes from settings where a third party already sees the transaction, such as an employer paying wages or a firm buying from another firm. Online selling differs, because many sellers trade through messaging apps and social media, where no marketplace records the sale (BPS 2025a). How far a rule built on platform records can reach depends on how much selling happens on platforms. The studies reviewed here do not estimate that share for Indonesia.</w:t>
       </w:r>
     </w:p>
-    <w:bookmarkEnd w:id="27"/>
-    <w:bookmarkStart w:id="28" w:name="research-gap"/>
+    <w:bookmarkEnd w:id="28"/>
+    <w:bookmarkStart w:id="29" w:name="research-gap"/>
     <w:p>
       <w:pPr>
         <w:pStyle w:val="Heading2"/>
@@ -756,7 +1655,7 @@
         <w:t xml:space="preserve"> </w:t>
       </w:r>
       <w:r>
-        <w:t xml:space="preserve">This follows from Section 2.1, which explains why the share is small and can move but does not test whether reported revenue stays a fair guide to the commerce.</w:t>
+        <w:t xml:space="preserve">This follows from Section 2.1. It explains why the share is small and can move, but it does not test whether revenue stays a fair guide to the commerce.</w:t>
       </w:r>
     </w:p>
     <w:p>
@@ -778,7 +1677,7 @@
         <w:t xml:space="preserve"> </w:t>
       </w:r>
       <w:r>
-        <w:t xml:space="preserve">This follows from Section 2.2, which shows that figures differ but does not test whether they grow for the same reasons, or what a rise in the count of sellers contains.</w:t>
+        <w:t xml:space="preserve">This follows from Section 2.2. It shows that figures differ, but it does not test whether they grow for the same reasons, or what a rise in the count of sellers contains.</w:t>
       </w:r>
     </w:p>
     <w:p>
@@ -800,12 +1699,12 @@
         <w:t xml:space="preserve"> </w:t>
       </w:r>
       <w:r>
-        <w:t xml:space="preserve">This follows from Section 2.3, which shows that platform records are valuable but not how much of online selling they cover.</w:t>
-      </w:r>
-    </w:p>
-    <w:bookmarkEnd w:id="28"/>
+        <w:t xml:space="preserve">This follows from Section 2.3. It shows that platform records are valuable, but not how much of online selling they cover.</w:t>
+      </w:r>
+    </w:p>
     <w:bookmarkEnd w:id="29"/>
-    <w:bookmarkStart w:id="39" w:name="chapter-3.-framework-and-hypotheses"/>
+    <w:bookmarkEnd w:id="30"/>
+    <w:bookmarkStart w:id="40" w:name="chapter-3.-framework-and-hypotheses"/>
     <w:p>
       <w:pPr>
         <w:pStyle w:val="Heading1"/>
@@ -847,18 +1746,18 @@
           <wp:inline>
             <wp:extent cx="5302908" cy="2896109"/>
             <wp:effectExtent b="0" l="0" r="0" t="0"/>
-            <wp:docPr descr="" title="" id="31" name="Picture"/>
+            <wp:docPr descr="" title="" id="32" name="Picture"/>
             <a:graphic>
               <a:graphicData uri="http://schemas.openxmlformats.org/drawingml/2006/picture">
                 <pic:pic>
                   <pic:nvPicPr>
-                    <pic:cNvPr descr="figures/fig3_1_two_links.png" id="32" name="Picture"/>
+                    <pic:cNvPr descr="figures/fig3_1_two_links.png" id="33" name="Picture"/>
                     <pic:cNvPicPr>
                       <a:picLocks noChangeArrowheads="1" noChangeAspect="1"/>
                     </pic:cNvPicPr>
                   </pic:nvPicPr>
                   <pic:blipFill>
-                    <a:blip r:embed="rId30"/>
+                    <a:blip r:embed="rId31"/>
                     <a:stretch>
                       <a:fillRect/>
                     </a:stretch>
@@ -1003,7 +1902,7 @@
         <w:t xml:space="preserve">The three objectives set in Chapter 1 sit inside this map. Measuring the wedge and tracing its large moves serve the first question, and comparing platform figures with national and payment figures serves the second. The third question is answered by a further analysis.</w:t>
       </w:r>
     </w:p>
-    <w:bookmarkStart w:id="33" w:name="terms-and-rules-for-comparison"/>
+    <w:bookmarkStart w:id="34" w:name="terms-and-rules-for-comparison"/>
     <w:p>
       <w:pPr>
         <w:pStyle w:val="Heading2"/>
@@ -1562,8 +2461,8 @@
         <w:t xml:space="preserve">Every figure also keeps a label for where it comes from. Figures that companies report are kept apart from figures that the thesis constructs, and both are kept apart from national statistics and payment figures. Chapter 4 applies these rules platform by platform.</w:t>
       </w:r>
     </w:p>
-    <w:bookmarkEnd w:id="33"/>
-    <w:bookmarkStart w:id="34" w:name="three-measures"/>
+    <w:bookmarkEnd w:id="34"/>
+    <w:bookmarkStart w:id="35" w:name="three-measures"/>
     <w:p>
       <w:pPr>
         <w:pStyle w:val="Heading2"/>
@@ -1704,8 +2603,8 @@
         <w:t xml:space="preserve">A platform that keeps 2 percent of each sale has an ecosystem ratio of 49. If its transaction value is flat, a rise in its take rate to 3 percent raises its revenue by 50 percent. A platform that keeps 17 percent has an ecosystem ratio near 5, and a rise to 18 percent raises its revenue by about 6 percent. So a large ecosystem ratio means that ordinary changes in fees or discounts can produce large swings in reported revenue growth.</w:t>
       </w:r>
     </w:p>
-    <w:bookmarkEnd w:id="34"/>
-    <w:bookmarkStart w:id="35" w:name="tracing-a-movement"/>
+    <w:bookmarkEnd w:id="35"/>
+    <w:bookmarkStart w:id="36" w:name="tracing-a-movement"/>
     <w:p>
       <w:pPr>
         <w:pStyle w:val="Heading2"/>
@@ -1776,8 +2675,8 @@
         <w:t xml:space="preserve">Equation (6) also shows where a rule acts. A cap on commissions acts on the fee rate, and a limit on discounts acts on the incentive rate. Chapter 6 sets Indonesia’s recent rules against these parts of the take rate.</w:t>
       </w:r>
     </w:p>
-    <w:bookmarkEnd w:id="35"/>
-    <w:bookmarkStart w:id="36" w:name="hypotheses"/>
+    <w:bookmarkEnd w:id="36"/>
+    <w:bookmarkStart w:id="37" w:name="hypotheses"/>
     <w:p>
       <w:pPr>
         <w:pStyle w:val="Heading2"/>
@@ -2142,8 +3041,8 @@
         <w:t xml:space="preserve">The H2 split is arithmetic. It does not assign new businesses to channels, and it does not show whether the businesses in the count are new.</w:t>
       </w:r>
     </w:p>
-    <w:bookmarkEnd w:id="36"/>
-    <w:bookmarkStart w:id="37" w:name="the-entry-test"/>
+    <w:bookmarkEnd w:id="37"/>
+    <w:bookmarkStart w:id="38" w:name="the-entry-test"/>
     <w:p>
       <w:pPr>
         <w:pStyle w:val="Heading2"/>
@@ -2236,8 +3135,8 @@
         <w:t xml:space="preserve">If the share of new sellers falls short, part of the rise is something other than first-time entry. Two readings are open. The survey may have reached more of the sellers who were already there. Or sellers may have come back after a pause, since a returning seller keeps an old start year. Small firms that stop are more often young firms with young owners (McKenzie and Paffhausen 2019). So the age of the sellers behind the rise bears on the second reading. Chapter 5 weighs the two readings with that evidence.</w:t>
       </w:r>
     </w:p>
-    <w:bookmarkEnd w:id="37"/>
-    <w:bookmarkStart w:id="38" w:name="further-analyses"/>
+    <w:bookmarkEnd w:id="38"/>
+    <w:bookmarkStart w:id="39" w:name="further-analyses"/>
     <w:p>
       <w:pPr>
         <w:pStyle w:val="Heading2"/>
@@ -2485,7 +3384,7 @@
         <w:pStyle w:val="BodyText"/>
       </w:pPr>
       <w:r>
-        <w:t xml:space="preserve">The market-value analysis asks whether investors, who price revenue (Section 2.1), treat its two sources alike. Equation (5) shows that revenue can grow in two ways, through more commerce or through a larger take rate. Early studies of internet companies found that markets priced measures of web activity beyond reported earnings (Trueman, Wong and Zhang 2000).</w:t>
+        <w:t xml:space="preserve">The market-value analysis asks whether investors, who price revenue (Section 2.1), treat its two sources alike. Equation (5) shows that revenue can grow in two ways, through more commerce or through a larger take rate. Early studies of internet companies found that markets priced measures of web activity beyond reported earnings (Trueman, Wong and Zhang 2000; Rajgopal, Venkatachalam and Kotha 2003).</w:t>
       </w:r>
     </w:p>
     <w:p>
@@ -2544,7 +3443,7 @@
         <w:pStyle w:val="BodyText"/>
       </w:pPr>
       <w:r>
-        <w:t xml:space="preserve">Record keeping is the second part of this analysis. The thesis compares how often marketplace sellers and other sellers keep financial statements. The comparison bears on the information that platform records can add. Chapter 6 develops the reach of the rules.</w:t>
+        <w:t xml:space="preserve">Record keeping is the second part of this analysis. The thesis compares how often marketplace sellers and other sellers keep financial statements. The comparison bears on the information that platform records can add.</w:t>
       </w:r>
     </w:p>
     <w:p>
@@ -2560,12 +3459,12 @@
         <w:pStyle w:val="BodyText"/>
       </w:pPr>
       <w:r>
-        <w:t xml:space="preserve">If two national figures move in opposite directions in the same year, the conclusion about growth depends on the figure chosen. The thesis compares their growth rates, each in its own unit, and compares levels only after reconciling what each source covers. Household spending, from the national accounts, serves as a further point of comparison. Chapter 4 describes the data and methods behind each test and analysis.</w:t>
-      </w:r>
-    </w:p>
-    <w:bookmarkEnd w:id="38"/>
+        <w:t xml:space="preserve">If two national figures move in opposite directions in one year, the conclusion about growth depends on the figure chosen. The thesis compares growth rates, each in its own unit, and levels only after reconciling what each source covers. Household spending is a further point of comparison.</w:t>
+      </w:r>
+    </w:p>
     <w:bookmarkEnd w:id="39"/>
-    <w:bookmarkStart w:id="50" w:name="chapter-4.-data-and-methods"/>
+    <w:bookmarkEnd w:id="40"/>
+    <w:bookmarkStart w:id="51" w:name="chapter-4.-data-and-methods"/>
     <w:p>
       <w:pPr>
         <w:pStyle w:val="Heading1"/>
@@ -2587,7 +3486,7 @@
         <w:pStyle w:val="BodyText"/>
       </w:pPr>
       <w:r>
-        <w:t xml:space="preserve">On the platform side, the thesis reads revenue and transaction value from annual reports, audited statements and earnings releases, and the extraction tables keep the source file and the quoted passage beside every value. The Indonesian platforms are three online marketplaces, Tokopedia, Bukalapak and Blibli, and GoTo, the group that runs the Gojek app for rides and deliveries. GoTo also controlled Tokopedia until 2024 and still holds a stake in it. Two regional companies, both based in Singapore, complete the group: Grab, which runs rides and deliveries across Southeast Asia, and Sea, whose marketplace is Shopee. Where a platform does not report Indonesia alone, as with Shopee and Grab, the thesis states what it derives or borrows and labels it.</w:t>
+        <w:t xml:space="preserve">On the platform side, the thesis reads revenue and transaction value from annual reports, audited statements and earnings releases. The extraction tables keep the source file and the quoted passage beside every value. The Indonesian platforms are three online marketplaces, Tokopedia, Bukalapak and Blibli, and GoTo, the group that runs the Gojek app for rides and deliveries. GoTo also controlled Tokopedia until 2024 and still holds a stake in it. Two regional companies, both based in Singapore, complete the group: Grab, which runs rides and deliveries across Southeast Asia, and Sea, whose marketplace is Shopee. Where a platform does not report Indonesia alone, as with Shopee and Grab, the thesis states what it derives or borrows and labels it.</w:t>
       </w:r>
     </w:p>
     <w:p>
@@ -2603,7 +3502,7 @@
         <w:pStyle w:val="BodyText"/>
       </w:pPr>
       <w:r>
-        <w:t xml:space="preserve">Setting the two sides against each other for one country is what makes the tests possible. Indonesia allows it. Five platform series report revenue and transaction value in the same year, three of them report what they pay out in incentives, and the survey asks every online seller when it began. The tests are built to ask only what these sources can answer, and each limit is stated where it applies.</w:t>
+        <w:t xml:space="preserve">Setting the two sides against each other for one country is what makes the tests possible. Indonesia allows it. Five platform series report revenue and transaction value in the same year, and three of them report what they pay out in incentives. The survey asks every online seller when it began. The tests are built to ask only what these sources can answer, and each limit is stated where it applies.</w:t>
       </w:r>
     </w:p>
     <w:p>
@@ -2614,7 +3513,7 @@
         <w:t xml:space="preserve">The chapter describes the evidence on each side and the tests that use it. It starts with the platforms: the data, the wedge in Indonesia, the test of H1, the tracing of large moves and market values. It then turns to the survey: H2, the entry test, and the channels and records of sellers. It ends with the comparison of national figures and with how every number is labelled and traced.</w:t>
       </w:r>
     </w:p>
-    <w:bookmarkStart w:id="40" w:name="the-platform-data"/>
+    <w:bookmarkStart w:id="41" w:name="the-platform-data"/>
     <w:p>
       <w:pPr>
         <w:pStyle w:val="Heading2"/>
@@ -2636,7 +3535,7 @@
         <w:pStyle w:val="BodyText"/>
       </w:pPr>
       <w:r>
-        <w:t xml:space="preserve">Companies define transaction value in different ways, and some include shipping charges, digital goods or travel. The thesis keeps each company’s own definition and records it. Under the second rule of Section 3.1, the definition cancels out of a take rate’s yearly changes, as long as the company keeps both the definition and the mix of its businesses.</w:t>
+        <w:t xml:space="preserve">Companies define transaction value in different ways, and some include shipping charges, digital goods or travel. The thesis keeps each company’s own definition and records it. Under the second rule of Section 3.1, the definition cancels out of a take rate’s yearly changes. This holds as long as the company keeps both the definition and the mix of its businesses.</w:t>
       </w:r>
     </w:p>
     <w:p>
@@ -3081,8 +3980,8 @@
         <w:t xml:space="preserve">Two platforms sit close to that line. Zalando is one of the eight and sells part of what it carries, so Appendix B repeats the test without it. One added pair, Ozon from 2021 to 2022, ends in a kept year but starts in a dropped one. Appendix B repeats the test without Ozon as well. The result is 15 pairs for the Indonesian and regional group and 158 for the foreign group.</w:t>
       </w:r>
     </w:p>
-    <w:bookmarkEnd w:id="40"/>
-    <w:bookmarkStart w:id="41" w:name="measuring-the-wedge-in-indonesia"/>
+    <w:bookmarkEnd w:id="41"/>
+    <w:bookmarkStart w:id="42" w:name="measuring-the-wedge-in-indonesia"/>
     <w:p>
       <w:pPr>
         <w:pStyle w:val="Heading2"/>
@@ -3107,8 +4006,8 @@
         <w:t xml:space="preserve">Each platform reaches the sum by its own route. Tokopedia reports both amounts for its segment. Shopee’s transaction value is an outside estimate by Momentum Works, a research firm that tracks online commerce in Southeast Asia. Its revenue assumes a take rate of 10 percent, which the thesis varies from 9 to 11 percent. Grab reports its Indonesian revenue, and the thesis derives its Indonesian transaction value from Grab’s company-wide ratio of the two amounts. The thesis drops each platform in turn, and it repeats the exercise for every platform-year between 2020 and 2025 that the filings allow.</w:t>
       </w:r>
     </w:p>
-    <w:bookmarkEnd w:id="41"/>
-    <w:bookmarkStart w:id="42" w:name="testing-h1"/>
+    <w:bookmarkEnd w:id="42"/>
+    <w:bookmarkStart w:id="43" w:name="testing-h1"/>
     <w:p>
       <w:pPr>
         <w:pStyle w:val="Heading2"/>
@@ -3149,8 +4048,8 @@
         <w:t xml:space="preserve">Appendix B lists the checks on this test. They drop each platform in turn and treat Tokopedia and GoTo as one company. They repeat the test with growth divergence in points as Chapter 3 defines it. They compare the change in the take rate in percentage points, to see whether a thin take rate explains the result. They narrow the test to the three marketplaces, correlate revenue growth with transaction value growth, and repeat the test with quarterly pairs.</w:t>
       </w:r>
     </w:p>
-    <w:bookmarkEnd w:id="42"/>
-    <w:bookmarkStart w:id="43" w:name="tracing-the-moves"/>
+    <w:bookmarkEnd w:id="43"/>
+    <w:bookmarkStart w:id="44" w:name="tracing-the-moves"/>
     <w:p>
       <w:pPr>
         <w:pStyle w:val="Heading2"/>
@@ -3172,7 +4071,7 @@
         <w:pStyle w:val="BodyText"/>
       </w:pPr>
       <w:r>
-        <w:t xml:space="preserve">The second step splits the take-rate change with equation (6). Wherever a company discloses both its gross fees and its incentives, the thesis splits the growth of revenue over a window into three parts: more commerce, a change in the fee rate and a change in the incentive rate. A change in the mix of businesses is recorded from the company’s reports.</w:t>
+        <w:t xml:space="preserve">The second step splits the take-rate change with equation (6). Some companies disclose both their gross fees and their incentives. For them, the thesis splits the growth of revenue over a window into three parts: more commerce, a change in the fee rate and a change in the incentive rate. A change in the mix of businesses is recorded from the company’s reports.</w:t>
       </w:r>
     </w:p>
     <w:p>
@@ -3191,8 +4090,8 @@
         <w:t xml:space="preserve">Grab is read from its annual filings and GoTo from its audited statements. Blibli does not report incentives, so its split rests on a proxy built from its releases. Seven windows are traced, and Appendix A lists them. The thesis also records where accounting treatment or reporting scope matters, such as the deduction of incentives from revenue and the travel business inside Blibli’s retail segment. Company explanations are read as reports and are not tested.</w:t>
       </w:r>
     </w:p>
-    <w:bookmarkEnd w:id="43"/>
-    <w:bookmarkStart w:id="44" w:name="market-values"/>
+    <w:bookmarkEnd w:id="44"/>
+    <w:bookmarkStart w:id="45" w:name="market-values"/>
     <w:p>
       <w:pPr>
         <w:pStyle w:val="Heading2"/>
@@ -3217,8 +4116,8 @@
         <w:t xml:space="preserve">Equation (8) is estimated with a fixed effect for each year, which removes what all platforms share in that year. Standard errors are clustered by company, which allows for the repeated observations of one company. Each prediction names a direction, so both tests are one-sided. The test was written down before the market values were pulled. The result is an association, and market value also changes when a company issues shares, so the thesis does not call it a stock return. A second run adds five segment series and Mercado Libre as a robustness check. Grab, GoTo and Sea enter only there, because their reported transaction value covers only part of the business that the market value prices.</w:t>
       </w:r>
     </w:p>
-    <w:bookmarkEnd w:id="44"/>
-    <w:bookmarkStart w:id="45" w:name="the-survey-files-and-h2"/>
+    <w:bookmarkEnd w:id="45"/>
+    <w:bookmarkStart w:id="46" w:name="the-survey-files-and-h2"/>
     <w:p>
       <w:pPr>
         <w:pStyle w:val="Heading2"/>
@@ -3545,8 +4444,8 @@
         <w:t xml:space="preserve">*Implied by the published count for 2023 and its published growth of 27.4 percent.</w:t>
       </w:r>
     </w:p>
-    <w:bookmarkEnd w:id="45"/>
-    <w:bookmarkStart w:id="46" w:name="the-entry-test-and-the-extra-sellers"/>
+    <w:bookmarkEnd w:id="46"/>
+    <w:bookmarkStart w:id="47" w:name="the-entry-test-and-the-extra-sellers"/>
     <w:p>
       <w:pPr>
         <w:pStyle w:val="Heading2"/>
@@ -3595,8 +4494,8 @@
         <w:t xml:space="preserve">The cohort check and the further checks were designed after the entry test failed, so Chapter 5 labels them exploratory. The exception is the median change in sellers’ sales, which was registered. The files cannot rule out returners, because a seller who stopped and returned keeps an old start year.</w:t>
       </w:r>
     </w:p>
-    <w:bookmarkEnd w:id="46"/>
-    <w:bookmarkStart w:id="47" w:name="channels-records-and-reach"/>
+    <w:bookmarkEnd w:id="47"/>
+    <w:bookmarkStart w:id="48" w:name="channels-records-and-reach"/>
     <w:p>
       <w:pPr>
         <w:pStyle w:val="Heading2"/>
@@ -3642,11 +4541,11 @@
         <w:pStyle w:val="BodyText"/>
       </w:pPr>
       <w:r>
-        <w:t xml:space="preserve">A third analysis builds on the first two and is developed in Chapter 6. It counts the marketplace sellers whose revenue is above a bracket line and expresses the count as a share of all online sellers. At the 2022 rate, BPS’s brackets divide at about US$20,000 a year. The marketplace tax exempts individual sellers up to about US$34,000. So the count above BPS’s line is an upper limit on the sellers the tax can reach. Chapter 6 also sets each recent rule against the part of the figures it acts on. The thesis reads each legal text where it is published, and it labels each rule by the status of its text: primary text read, announced, or reported in the news only.</w:t>
-      </w:r>
-    </w:p>
-    <w:bookmarkEnd w:id="47"/>
-    <w:bookmarkStart w:id="48" w:name="comparing-national-figures"/>
+        <w:t xml:space="preserve">A third analysis builds on the first two and is developed in Chapter 6. It counts the marketplace sellers whose revenue is above a bracket line and expresses the count as a share of all online sellers. At the 2022 rate, BPS’s brackets divide at about US$20,000 a year. The marketplace tax exempts individual sellers up to about US$34,000. So the count above BPS’s line is an upper limit on the sellers the tax can reach. Chapter 6 also sets each recent rule against the part of the figures it acts on. The thesis reads each legal text where it is published. It labels each rule by the status of its text: primary text read, announced, or reported in the news only.</w:t>
+      </w:r>
+    </w:p>
+    <w:bookmarkEnd w:id="48"/>
+    <w:bookmarkStart w:id="49" w:name="comparing-national-figures"/>
     <w:p>
       <w:pPr>
         <w:pStyle w:val="Heading2"/>
@@ -4003,8 +4902,8 @@
         </w:tc>
       </w:tr>
     </w:tbl>
-    <w:bookmarkEnd w:id="48"/>
-    <w:bookmarkStart w:id="49" w:name="labels-traceability-and-licensed-data"/>
+    <w:bookmarkEnd w:id="49"/>
+    <w:bookmarkStart w:id="50" w:name="labels-traceability-and-licensed-data"/>
     <w:p>
       <w:pPr>
         <w:pStyle w:val="Heading2"/>
@@ -4037,9 +4936,9 @@
         <w:t xml:space="preserve">Three sources are licensed and are not in the repository: the BPS survey files, the LSEG market values and the World Bank survey files. The repository records the size and checksum of each BPS and LSEG file and of the World Bank cross-country query, so anyone who obtains the same files can check them. It holds the code that reads them and the national totals that the code produces, and no business-level record. BPS is cited as the source of every survey figure, in line with the data-use agreement. Chapter 7 states what these data cannot show.</w:t>
       </w:r>
     </w:p>
-    <w:bookmarkEnd w:id="49"/>
     <w:bookmarkEnd w:id="50"/>
-    <w:bookmarkStart w:id="76" w:name="chapter-5.-results"/>
+    <w:bookmarkEnd w:id="51"/>
+    <w:bookmarkStart w:id="77" w:name="chapter-5.-results"/>
     <w:p>
       <w:pPr>
         <w:pStyle w:val="Heading1"/>
@@ -4927,7 +5826,7 @@
         </w:tc>
       </w:tr>
     </w:tbl>
-    <w:bookmarkStart w:id="51" w:name="how-much-revenue-leaves-out"/>
+    <w:bookmarkStart w:id="52" w:name="how-much-revenue-leaves-out"/>
     <w:p>
       <w:pPr>
         <w:pStyle w:val="Heading2"/>
@@ -5387,8 +6286,8 @@
         <w:t xml:space="preserve">Platform commerce is itself only part of online commerce. In BPS’s survey, marketplaces carry about a fifth of online sales value (Section 5.9), so platform revenue shows a smaller part still. A small share can still be a fair guide to the commerce, as long as it keeps its size from year to year.</w:t>
       </w:r>
     </w:p>
-    <w:bookmarkEnd w:id="51"/>
-    <w:bookmarkStart w:id="55" w:name="testing-h1-1"/>
+    <w:bookmarkEnd w:id="52"/>
+    <w:bookmarkStart w:id="56" w:name="testing-h1-1"/>
     <w:p>
       <w:pPr>
         <w:pStyle w:val="Heading2"/>
@@ -5890,18 +6789,18 @@
           <wp:inline>
             <wp:extent cx="5334000" cy="1965026"/>
             <wp:effectExtent b="0" l="0" r="0" t="0"/>
-            <wp:docPr descr="" title="" id="53" name="Picture"/>
+            <wp:docPr descr="" title="" id="54" name="Picture"/>
             <a:graphic>
               <a:graphicData uri="http://schemas.openxmlformats.org/drawingml/2006/picture">
                 <pic:pic>
                   <pic:nvPicPr>
-                    <pic:cNvPr descr="figures/fig5_1_thin_slice.png" id="54" name="Picture"/>
+                    <pic:cNvPr descr="figures/fig5_1_thin_slice.png" id="55" name="Picture"/>
                     <pic:cNvPicPr>
                       <a:picLocks noChangeArrowheads="1" noChangeAspect="1"/>
                     </pic:cNvPicPr>
                   </pic:nvPicPr>
                   <pic:blipFill>
-                    <a:blip r:embed="rId52"/>
+                    <a:blip r:embed="rId53"/>
                     <a:stretch>
                       <a:fillRect/>
                     </a:stretch>
@@ -5946,8 +6845,8 @@
         <w:t xml:space="preserve">Each dot is one platform’s median over its years. Left: the share of each sale that the platform keeps, on a log scale. Middle: the yearly change in that share, in percentage points. Right: the same change relative to the share itself, as a log change in percent. Black bars mark group medians. The foreign group has 26 platforms here and 27 in the main test, because one platform has no pair of usable years for the change in points. Source: company filings; author’s calculations. Exploratory.</w:t>
       </w:r>
     </w:p>
-    <w:bookmarkEnd w:id="55"/>
-    <w:bookmarkStart w:id="59" w:name="what-moved-the-take-rate"/>
+    <w:bookmarkEnd w:id="56"/>
+    <w:bookmarkStart w:id="60" w:name="what-moved-the-take-rate"/>
     <w:p>
       <w:pPr>
         <w:pStyle w:val="Heading2"/>
@@ -6541,18 +7440,18 @@
           <wp:inline>
             <wp:extent cx="5334000" cy="1805277"/>
             <wp:effectExtent b="0" l="0" r="0" t="0"/>
-            <wp:docPr descr="" title="" id="57" name="Picture"/>
+            <wp:docPr descr="" title="" id="58" name="Picture"/>
             <a:graphic>
               <a:graphicData uri="http://schemas.openxmlformats.org/drawingml/2006/picture">
                 <pic:pic>
                   <pic:nvPicPr>
-                    <pic:cNvPr descr="figures/fig5_2_tokopedia_two_views.png" id="58" name="Picture"/>
+                    <pic:cNvPr descr="figures/fig5_2_tokopedia_two_views.png" id="59" name="Picture"/>
                     <pic:cNvPicPr>
                       <a:picLocks noChangeArrowheads="1" noChangeAspect="1"/>
                     </pic:cNvPicPr>
                   </pic:nvPicPr>
                   <pic:blipFill>
-                    <a:blip r:embed="rId56"/>
+                    <a:blip r:embed="rId57"/>
                     <a:stretch>
                       <a:fillRect/>
                     </a:stretch>
@@ -6605,8 +7504,8 @@
         <w:t xml:space="preserve">Tokopedia is not the only case of revenue rising while the commerce shrank. From 2024 to 2025, Blibli’s transaction value fell by about 2 percent while its revenue rose by about 12 percent. In the windows traced here, revenue growth was not a fair guide to the commerce the platforms carried. Whether markets treated it as one is a separate question.</w:t>
       </w:r>
     </w:p>
-    <w:bookmarkEnd w:id="59"/>
-    <w:bookmarkStart w:id="60" w:name="what-markets-valued"/>
+    <w:bookmarkEnd w:id="60"/>
+    <w:bookmarkStart w:id="61" w:name="what-markets-valued"/>
     <w:p>
       <w:pPr>
         <w:pStyle w:val="Heading2"/>
@@ -6644,11 +7543,11 @@
         <w:pStyle w:val="BodyText"/>
       </w:pPr>
       <w:r>
-        <w:t xml:space="preserve">Market value follows the commerce a platform carries. Early studies found a similar link, with markets pricing measures of web activity beyond earnings (Trueman, Wong and Zhang 2000). The data do not show that markets valued growth from pricing any less. Revenue and transaction value come from the platforms’ own reports, and market value from share prices. The national figures give a separate view of the same commerce.</w:t>
-      </w:r>
-    </w:p>
-    <w:bookmarkEnd w:id="60"/>
-    <w:bookmarkStart w:id="64" w:name="the-platforms-and-the-sellers-in-2023"/>
+        <w:t xml:space="preserve">Market value follows the commerce a platform carries. Early studies found a similar link, with markets pricing measures of web activity beyond earnings (Trueman, Wong and Zhang 2000; Rajgopal, Venkatachalam and Kotha 2003). Here the measure of activity is transaction value, which the platforms report themselves. How a firm records revenue matters too. After the 2000 crash, revenue explained less of the prices of internet firms that booked the full sale amount as revenue (Davis 2002). The data do not show that markets valued growth from pricing any less. Revenue and transaction value come from the platforms’ own reports, and market value from share prices. The national figures give a separate view of the same commerce.</w:t>
+      </w:r>
+    </w:p>
+    <w:bookmarkEnd w:id="61"/>
+    <w:bookmarkStart w:id="65" w:name="the-platforms-and-the-sellers-in-2023"/>
     <w:p>
       <w:pPr>
         <w:pStyle w:val="Heading2"/>
@@ -6682,18 +7581,18 @@
           <wp:inline>
             <wp:extent cx="5334000" cy="2862754"/>
             <wp:effectExtent b="0" l="0" r="0" t="0"/>
-            <wp:docPr descr="" title="" id="62" name="Picture"/>
+            <wp:docPr descr="" title="" id="63" name="Picture"/>
             <a:graphic>
               <a:graphicData uri="http://schemas.openxmlformats.org/drawingml/2006/picture">
                 <pic:pic>
                   <pic:nvPicPr>
-                    <pic:cNvPr descr="figures/fig5_3_growth_2023.png" id="63" name="Picture"/>
+                    <pic:cNvPr descr="figures/fig5_3_growth_2023.png" id="64" name="Picture"/>
                     <pic:cNvPicPr>
                       <a:picLocks noChangeArrowheads="1" noChangeAspect="1"/>
                     </pic:cNvPicPr>
                   </pic:nvPicPr>
                   <pic:blipFill>
-                    <a:blip r:embed="rId61"/>
+                    <a:blip r:embed="rId62"/>
                     <a:stretch>
                       <a:fillRect/>
                     </a:stretch>
@@ -6754,8 +7653,8 @@
         <w:t xml:space="preserve">Fewer sellers reported a rise than a year earlier. About a quarter reported a rise and about a third a fall. A year before, more than a third had reported a rise and a quarter a fall. The mean change was about −4 percent. Lack of demand became the main obstacle, named by 41 percent of sellers against 35 percent in 2022. The published count of online sellers nonetheless rose by 27 percent in 2023. A rise of that size, in a year without a boom in sales, needs explaining.</w:t>
       </w:r>
     </w:p>
-    <w:bookmarkEnd w:id="64"/>
-    <w:bookmarkStart w:id="65" w:name="h2-and-the-entry-test"/>
+    <w:bookmarkEnd w:id="65"/>
+    <w:bookmarkStart w:id="66" w:name="h2-and-the-entry-test"/>
     <w:p>
       <w:pPr>
         <w:pStyle w:val="Heading2"/>
@@ -6796,8 +7695,8 @@
         <w:t xml:space="preserve">Recall error does not explain the shortfall. As Section 3.5 noted, sellers who report a start date later than the true one make new sellers look more numerous. Such errors push the share toward passing, so the shortfall is, if anything, understated. Part of the 2023 rise in the count is something other than first-time entry, and its size is the next result.</w:t>
       </w:r>
     </w:p>
-    <w:bookmarkEnd w:id="65"/>
-    <w:bookmarkStart w:id="66" w:name="what-the-rise-in-the-count-contains"/>
+    <w:bookmarkEnd w:id="66"/>
+    <w:bookmarkStart w:id="67" w:name="what-the-rise-in-the-count-contains"/>
     <w:p>
       <w:pPr>
         <w:pStyle w:val="Heading2"/>
@@ -7057,7 +7956,7 @@
         <w:pStyle w:val="BodyText"/>
       </w:pPr>
       <w:r>
-        <w:t xml:space="preserve">The extra count also bears on H2, in an exploratory follow-up. H2’s split treats every seller in the count as having entered. Suppose instead that the sellers not explained by entry were reached by wider coverage, and that their sales came with them. With both taken out of the 2023 figures, more businesses account for about 54 percent of the growth if no seller stopped, and about 42 percent if sellers stopped at 5 percent a year. H2 requires more than 50 percent. So H2 holds on the published series, but it sits on its threshold once the extra count is read as coverage. Taking out the sellers but keeping their sales gives 34 to 47 percent, though that version treats the count and the value unevenly.</w:t>
+        <w:t xml:space="preserve">The extra count also bears on H2, in an exploratory follow-up. H2’s split treats every seller in the count as having entered. Suppose instead that the sellers not explained by entry were reached by wider coverage, and that their sales came with them. Take both out of the 2023 figures. More businesses then account for about 54 percent of the growth if no seller stopped, and about 42 percent if sellers stopped at 5 percent a year. H2 requires more than 50 percent. So H2 holds on the published series, but it sits on its threshold once the extra count is read as coverage. Taking out the sellers but keeping their sales gives 34 to 47 percent, though that version treats the count and the value unevenly.</w:t>
       </w:r>
     </w:p>
     <w:p>
@@ -7068,8 +7967,8 @@
         <w:t xml:space="preserve">The checks point to a survey that reached more chat and social sellers in 2023, the kind of break that Section 3.5 described. The files cannot separate that reading from sellers returning after a pause. Who the extra sellers were bears on the choice between the two.</w:t>
       </w:r>
     </w:p>
-    <w:bookmarkEnd w:id="66"/>
-    <w:bookmarkStart w:id="70" w:name="who-the-extra-sellers-were"/>
+    <w:bookmarkEnd w:id="67"/>
+    <w:bookmarkStart w:id="71" w:name="who-the-extra-sellers-were"/>
     <w:p>
       <w:pPr>
         <w:pStyle w:val="Heading2"/>
@@ -7095,18 +7994,18 @@
           <wp:inline>
             <wp:extent cx="5334000" cy="2117141"/>
             <wp:effectExtent b="0" l="0" r="0" t="0"/>
-            <wp:docPr descr="" title="" id="68" name="Picture"/>
+            <wp:docPr descr="" title="" id="69" name="Picture"/>
             <a:graphic>
               <a:graphicData uri="http://schemas.openxmlformats.org/drawingml/2006/picture">
                 <pic:pic>
                   <pic:nvPicPr>
-                    <pic:cNvPr descr="figures/fig5_4_extra_sellers.png" id="69" name="Picture"/>
+                    <pic:cNvPr descr="figures/fig5_4_extra_sellers.png" id="70" name="Picture"/>
                     <pic:cNvPicPr>
                       <a:picLocks noChangeArrowheads="1" noChangeAspect="1"/>
                     </pic:cNvPicPr>
                   </pic:nvPicPr>
                   <pic:blipFill>
-                    <a:blip r:embed="rId67"/>
+                    <a:blip r:embed="rId68"/>
                     <a:stretch>
                       <a:fillRect/>
                     </a:stretch>
@@ -7183,8 +8082,8 @@
         <w:t xml:space="preserve">Returning sellers still cannot be ruled out. Returners equal to 10 to 15 percent of the 2022 count would remove the unexplained part, which is a scenario and not an estimate. The files carry no linked histories, and BPS changed how it asks about months between the rounds. Exits, or a move to full-year selling, could also offset part-year returners. Where online sellers sell, and what records they keep, complete the survey evidence.</w:t>
       </w:r>
     </w:p>
-    <w:bookmarkEnd w:id="70"/>
-    <w:bookmarkStart w:id="74" w:name="channels-and-records"/>
+    <w:bookmarkEnd w:id="71"/>
+    <w:bookmarkStart w:id="75" w:name="channels-and-records"/>
     <w:p>
       <w:pPr>
         <w:pStyle w:val="Heading2"/>
@@ -7223,6 +8122,14 @@
       </w:pPr>
       <w:r>
         <w:t xml:space="preserve">Almost all of the recent growth in value came from outside the marketplaces. From 2023 to 2024, BPS’s marketplace value grew by about 1.5 percent and other channels by about 21 percent. BPS’s marketplace category is itself broad: 43 percent of its sellers use only Gojek or Grab, and 47 percent use a shopping marketplace.</w:t>
+      </w:r>
+    </w:p>
+    <w:p>
+      <w:pPr>
+        <w:pStyle w:val="BodyText"/>
+      </w:pPr>
+      <w:r>
+        <w:t xml:space="preserve">Records are thinner outside the marketplaces. In 2023, about 29 percent of marketplace sellers kept complete financial statements, against about 12 percent of other sellers. Figure 5.5 shows the share of all sellers who keep them falling. The fall from 2020 to 2022 came while the survey appears to have counted the same kinds of seller. The fall in 2023 may partly reflect the chat-only sellers added to the count.</w:t>
       </w:r>
     </w:p>
     <w:p>
@@ -7234,18 +8141,18 @@
           <wp:inline>
             <wp:extent cx="5334000" cy="2553101"/>
             <wp:effectExtent b="0" l="0" r="0" t="0"/>
-            <wp:docPr descr="" title="" id="72" name="Picture"/>
+            <wp:docPr descr="" title="" id="73" name="Picture"/>
             <a:graphic>
               <a:graphicData uri="http://schemas.openxmlformats.org/drawingml/2006/picture">
                 <pic:pic>
                   <pic:nvPicPr>
-                    <pic:cNvPr descr="figures/fig5_5_marketplace_and_records.png" id="73" name="Picture"/>
+                    <pic:cNvPr descr="figures/fig5_5_marketplace_and_records.png" id="74" name="Picture"/>
                     <pic:cNvPicPr>
                       <a:picLocks noChangeArrowheads="1" noChangeAspect="1"/>
                     </pic:cNvPicPr>
                   </pic:nvPicPr>
                   <pic:blipFill>
-                    <a:blip r:embed="rId71"/>
+                    <a:blip r:embed="rId72"/>
                     <a:stretch>
                       <a:fillRect/>
                     </a:stretch>
@@ -7295,14 +8202,6 @@
         <w:pStyle w:val="BodyText"/>
       </w:pPr>
       <w:r>
-        <w:t xml:space="preserve">Records are thinner outside the marketplaces. In 2023, about 29 percent of marketplace sellers kept complete financial statements, against about 12 percent of other sellers. Figure 5.5 shows the share of all sellers who keep them falling. The fall from 2020 to 2022 came while the survey appears to have counted the same kinds of seller. The fall in 2023 may partly reflect the chat-only sellers added to the count.</w:t>
-      </w:r>
-    </w:p>
-    <w:p>
-      <w:pPr>
-        <w:pStyle w:val="BodyText"/>
-      </w:pPr>
-      <w:r>
         <w:t xml:space="preserve">The fall reaches long-running sellers too, an exploratory finding. Among sellers who began before 2020, the share keeping complete statements fell from about 23 percent in 2022 to about 17 percent in 2023.</w:t>
       </w:r>
     </w:p>
@@ -7346,8 +8245,8 @@
         <w:t xml:space="preserve">The split by channel bears on the third question of Section 2.4, because a rule built on platform records reaches only the marketplace part. Chapter 6 measures that reach. The same split also marks where the national figures part.</w:t>
       </w:r>
     </w:p>
-    <w:bookmarkEnd w:id="74"/>
-    <w:bookmarkStart w:id="75" w:name="why-the-national-figures-disagree"/>
+    <w:bookmarkEnd w:id="75"/>
+    <w:bookmarkStart w:id="76" w:name="why-the-national-figures-disagree"/>
     <w:p>
       <w:pPr>
         <w:pStyle w:val="Heading2"/>
@@ -7428,9 +8327,9 @@
         <w:t xml:space="preserve">The results answer the research question at two levels. On the inner link, revenue showed a small part of the commerce and stopped being a fair guide when the take rate moved. On the outer link, the 2023 rise in the count of sellers was only partly first-time entry. The figures part most where only the survey looks. Chapter 6 turns to the rules that Indonesia is writing.</w:t>
       </w:r>
     </w:p>
-    <w:bookmarkEnd w:id="75"/>
     <w:bookmarkEnd w:id="76"/>
-    <w:bookmarkStart w:id="83" w:name="Xf3297f1c0094fd76621fe8d81a0cbffa613ab7d"/>
+    <w:bookmarkEnd w:id="77"/>
+    <w:bookmarkStart w:id="84" w:name="Xf3297f1c0094fd76621fe8d81a0cbffa613ab7d"/>
     <w:p>
       <w:pPr>
         <w:pStyle w:val="Heading1"/>
@@ -7455,7 +8354,7 @@
         <w:t xml:space="preserve">The marketplace tax is the rule aimed most directly at online sellers. It can collect from at most about 1 in 20 online sellers and about a fifth of online sales value. It also gives the state a record of every seller on the four marketplaces, including those who pay nothing. This chapter measures what each rule can reach, using the data of Chapter 5. What each rule changes can be seen only after it takes effect, and Section 6.5 sets out the predictions that will be scored on those results.</w:t>
       </w:r>
     </w:p>
-    <w:bookmarkStart w:id="77" w:name="the-rules-and-what-each-acts-on"/>
+    <w:bookmarkStart w:id="78" w:name="the-rules-and-what-each-acts-on"/>
     <w:p>
       <w:pPr>
         <w:pStyle w:val="Heading2"/>
@@ -8048,8 +8947,8 @@
         <w:t xml:space="preserve">The sections that follow take the other rules in the order of Figure 3.1, from the take rate outward.</w:t>
       </w:r>
     </w:p>
-    <w:bookmarkEnd w:id="77"/>
-    <w:bookmarkStart w:id="78" w:name="X28b7fd3199e423b82cfc8b23ae379c54a934281"/>
+    <w:bookmarkEnd w:id="78"/>
+    <w:bookmarkStart w:id="79" w:name="X28b7fd3199e423b82cfc8b23ae379c54a934281"/>
     <w:p>
       <w:pPr>
         <w:pStyle w:val="Heading2"/>
@@ -8079,7 +8978,7 @@
         <w:pStyle w:val="BodyText"/>
       </w:pPr>
       <w:r>
-        <w:t xml:space="preserve">The arithmetic of the cap shows how small that slice is. At Grab, a cut from 20 to 8 percent on trips worth about 2 percent of on-demand transaction value lowers the on-demand take rate by at most about a quarter of a point, if nothing else changes. Grab’s on-demand take rate is about 13 percent. At GoTo, where two-wheel rides weigh more, the same arithmetic gives about 1 to 1.4 points on a take rate of about 22 percent. In both cases the wedge grows by the same amount. The cap moves money from the platform’s revenue to the drivers’ fares, inside the same transaction value.</w:t>
+        <w:t xml:space="preserve">The arithmetic of the cap shows how small that slice is. At Grab, the cut from 20 to 8 percent applies to trips worth about 2 percent of on-demand transaction value. If nothing else changes, it lowers the on-demand take rate by at most about a quarter of a point. Grab’s on-demand take rate is about 13 percent. At GoTo, where two-wheel rides weigh more, the same arithmetic gives about 1 to 1.4 points on a take rate of about 22 percent. In both cases the wedge grows by the same amount. The cap moves money from the platform’s revenue to the drivers’ fares, inside the same transaction value.</w:t>
       </w:r>
     </w:p>
     <w:p>
@@ -8158,8 +9057,8 @@
         <w:t xml:space="preserve">Marketplace fees moved the other way. Shopee, Tokopedia and TikTok Shop added a fixed fee to every order in mid-2025 (Islamiati 2025). In 2026, Shopee and TikTok Shop, which took over Tokopedia in 2024, raised their seller fees again (CNN Indonesia 2026a; Setyowati 2026). The government declined to cap these fees. It later required marketplaces to halve the service fee for small sellers of local products who apply for the discount (Ayudiana 2026). The rules on the take rate cap one fee on one ride-hailing service and leave the largest marketplace fees free. What the companies’ take rates did after the cap is the subject of the predictions in Section 6.5.</w:t>
       </w:r>
     </w:p>
-    <w:bookmarkEnd w:id="78"/>
-    <w:bookmarkStart w:id="79" w:name="how-far-the-marketplace-tax-reaches"/>
+    <w:bookmarkEnd w:id="79"/>
+    <w:bookmarkStart w:id="80" w:name="how-far-the-marketplace-tax-reaches"/>
     <w:p>
       <w:pPr>
         <w:pStyle w:val="Heading2"/>
@@ -8232,8 +9131,8 @@
         <w:t xml:space="preserve">The tax adds a record more than revenue. Whether sellers move away from the four marketplaces now that collection has started will be known only from later data.</w:t>
       </w:r>
     </w:p>
-    <w:bookmarkEnd w:id="79"/>
-    <w:bookmarkStart w:id="80" w:name="what-the-statistics-rules-can-change"/>
+    <w:bookmarkEnd w:id="80"/>
+    <w:bookmarkStart w:id="81" w:name="what-the-statistics-rules-can-change"/>
     <w:p>
       <w:pPr>
         <w:pStyle w:val="Heading2"/>
@@ -8274,8 +9173,8 @@
         <w:t xml:space="preserve">A new frame can move the count of sellers without any change in selling. About half of the 2023 rise was not explained by first-time entry (Section 5.7). When BPS adopts a frame from the 2026 census, counts on either side of the change will need the same care. The entry test of Section 3.5 can be repeated on the first survey that uses the new frame.</w:t>
       </w:r>
     </w:p>
-    <w:bookmarkEnd w:id="80"/>
-    <w:bookmarkStart w:id="81" w:name="what-the-registered-predictions-test"/>
+    <w:bookmarkEnd w:id="81"/>
+    <w:bookmarkStart w:id="82" w:name="what-the-registered-predictions-test"/>
     <w:p>
       <w:pPr>
         <w:pStyle w:val="Heading2"/>
@@ -8994,8 +9893,8 @@
         <w:t xml:space="preserve">The outcomes will be reported whatever their direction, as the other registered tests are.</w:t>
       </w:r>
     </w:p>
-    <w:bookmarkEnd w:id="81"/>
-    <w:bookmarkStart w:id="82" w:name="beyond-indonesia"/>
+    <w:bookmarkEnd w:id="82"/>
+    <w:bookmarkStart w:id="83" w:name="beyond-indonesia"/>
     <w:p>
       <w:pPr>
         <w:pStyle w:val="Heading2"/>
@@ -9036,9 +9935,9 @@
         <w:t xml:space="preserve">The thesis does not measure the split between channels outside Indonesia. Any statistics office that asks sellers which channels they use can make the same count, and with it measure how far its own rules reach.</w:t>
       </w:r>
     </w:p>
-    <w:bookmarkEnd w:id="82"/>
     <w:bookmarkEnd w:id="83"/>
-    <w:bookmarkStart w:id="89" w:name="chapter-7.-conclusion"/>
+    <w:bookmarkEnd w:id="84"/>
+    <w:bookmarkStart w:id="90" w:name="chapter-7.-conclusion"/>
     <w:p>
       <w:pPr>
         <w:pStyle w:val="Heading1"/>
@@ -9063,7 +9962,7 @@
         <w:t xml:space="preserve">This chapter answers the research question at both links of Figure 3.1. It then says what the answer adds for those who use the figures, reports the predictions that failed, states the limits of the evidence and sets out the next steps.</w:t>
       </w:r>
     </w:p>
-    <w:bookmarkStart w:id="84" w:name="the-answer-to-the-research-question"/>
+    <w:bookmarkStart w:id="85" w:name="the-answer-to-the-research-question"/>
     <w:p>
       <w:pPr>
         <w:pStyle w:val="Heading2"/>
@@ -9101,7 +10000,7 @@
         <w:pStyle w:val="BodyText"/>
       </w:pPr>
       <w:r>
-        <w:t xml:space="preserve">On the outer link, H2 holds on BPS’s published figures: more businesses account for most of the growth in online sales value. The registered entry test failed, and about half of the 2023 rise in the count is not explained by first-time entry. The extra count leaned toward long-running businesses. Read as wider coverage, it leaves H2 on its threshold: with those sellers and their sales taken out, more businesses account for about 42 to 54 percent of the growth, against the 50 percent H2 requires. In the same year, five of six measures of buying through platforms grew more slowly than household spending, and the median seller already online reported no change in sales. Reading BPS’s 2023 figures as a boom in online selling overstates what sellers and platforms reported.</w:t>
+        <w:t xml:space="preserve">On the outer link, H2 holds on BPS’s published figures: more businesses account for most of the growth in online sales value. The registered entry test failed, and about half of the 2023 rise in the count is not explained by first-time entry. The extra count leaned toward long-running businesses. Read as wider coverage, it leaves H2 on its threshold. With those sellers and their sales taken out, more businesses account for about 42 to 54 percent of the growth, against the 50 percent H2 requires. In the same year, five of six measures of buying through platforms grew more slowly than household spending, and the median seller already online reported no change in sales. Reading BPS’s 2023 figures as a boom in online selling overstates what sellers and platforms reported.</w:t>
       </w:r>
     </w:p>
     <w:p>
@@ -9112,8 +10011,8 @@
         <w:t xml:space="preserve">The national figures agree that growth was small where they cover the same sellers. They part outside the marketplaces, among the chat and social sellers that only BPS reaches. The figure a reader picks decides whether 2023 looks like a stall or a boom. Market value, for its part, moved with transaction value, and the data do not show that markets valued growth from pricing any less.</w:t>
       </w:r>
     </w:p>
-    <w:bookmarkEnd w:id="84"/>
-    <w:bookmarkStart w:id="85" w:name="what-the-thesis-adds"/>
+    <w:bookmarkEnd w:id="85"/>
+    <w:bookmarkStart w:id="86" w:name="what-the-thesis-adds"/>
     <w:p>
       <w:pPr>
         <w:pStyle w:val="Heading2"/>
@@ -9127,7 +10026,7 @@
         <w:pStyle w:val="FirstParagraph"/>
       </w:pPr>
       <w:r>
-        <w:t xml:space="preserve">For investors, the thesis adds a check that can be run on any platform that reports both amounts. Revenue growth splits into more commerce and a larger take rate with two public figures (equation (5)). In Indonesia, the take rate accounted for about two thirds of a revenue move at the typical pair, against about a quarter abroad. The thinner the take rate, the more a small change in fees or incentives moves revenue growth. Across 28 listed platforms, market value moved with transaction value, as a registered prediction stated.</w:t>
+        <w:t xml:space="preserve">For investors, the thesis adds a check that can be run on any platform that reports both amounts. Revenue growth splits into more commerce and a larger take rate with two public figures (equation (5)). In Indonesia, the take rate accounted for about two thirds of a revenue move at the typical pair, against about a quarter abroad. The thinner the take rate, the more a small change in fees or incentives moves revenue growth. The same split shows when market value per dollar of revenue and per dollar of commerce will disagree. Across 28 listed platforms, market value moved with transaction value, as a registered prediction stated. A 1 percent rise in transaction value went with about 0.6 percent more market value. Earlier studies used web traffic as the measure of activity; here it is the transaction value that platforms report themselves.</w:t>
       </w:r>
     </w:p>
     <w:p>
@@ -9154,8 +10053,8 @@
         <w:t xml:space="preserve">For research, the thesis adds connected evidence for one country: the platforms’ accounts, the sellers’ own answers and the rules that act on both. It tracks the invisible wedge and growth divergence over time, and its ecosystem ratio is the author’s own measure. All three use only figures that platforms already publish, so they can be computed for any platform that reports transaction value.</w:t>
       </w:r>
     </w:p>
-    <w:bookmarkEnd w:id="85"/>
-    <w:bookmarkStart w:id="86" w:name="predictions-that-failed"/>
+    <w:bookmarkEnd w:id="86"/>
+    <w:bookmarkStart w:id="87" w:name="predictions-that-failed"/>
     <w:p>
       <w:pPr>
         <w:pStyle w:val="Heading2"/>
@@ -9193,7 +10092,7 @@
         <w:pStyle w:val="BodyText"/>
       </w:pPr>
       <w:r>
-        <w:t xml:space="preserve">Three predictions on sellers’ records and sales failed narrowly or in part. The value share of sellers without financial statements fell by 5.8 points between 2020 and 2022, beyond the registered limit of 5, though by only 3.3 points on a second version. The mean sales of unregistered firms that use social media were about US$7,300 a year, above the registered limit of about US$6,600, while their median was about US$4,000. The comparison with Bank Indonesia’s figure held in two of three value scenarios and failed in the third.</w:t>
+        <w:t xml:space="preserve">Three predictions on sellers’ records and sales failed narrowly or in part. The value share of sellers without financial statements fell by 5.8 points between 2020 and 2022, beyond the registered limit of 5. On a second version it fell by only 3.3 points. The mean sales of unregistered firms that use social media were about US$7,300 a year, above the registered limit of about US$6,600, while their median was about US$4,000. The comparison with Bank Indonesia’s figure held in two of three value scenarios and failed in the third.</w:t>
       </w:r>
     </w:p>
     <w:p>
@@ -9209,11 +10108,11 @@
         <w:pStyle w:val="BodyText"/>
       </w:pPr>
       <w:r>
-        <w:t xml:space="preserve">Appendix C lists every registered test with its outcome. The predictions on the 2026 rules are scored in Section 6.5. One of them, that the start of the marketplace tax would slip again, was withdrawn, because the tax had started a day before the prediction was registered. A comparison of seven countries on firms’ digital records was withdrawn as a test for the same kind of reason: published figures seen at registration already settled it, so it is reported as descriptive.</w:t>
-      </w:r>
-    </w:p>
-    <w:bookmarkEnd w:id="86"/>
-    <w:bookmarkStart w:id="87" w:name="limits-of-the-evidence"/>
+        <w:t xml:space="preserve">Appendix C lists every registered test with its outcome. The predictions on the 2026 rules are scored in Section 6.5. One of them, that the start of the marketplace tax would slip again, was withdrawn, because the tax had started a day before the prediction was registered. A comparison of seven countries on firms’ digital records was withdrawn as a test for a similar reason. Published figures seen at registration already settled it, so it is reported as descriptive.</w:t>
+      </w:r>
+    </w:p>
+    <w:bookmarkEnd w:id="87"/>
+    <w:bookmarkStart w:id="88" w:name="limits-of-the-evidence"/>
     <w:p>
       <w:pPr>
         <w:pStyle w:val="Heading2"/>
@@ -9251,7 +10150,7 @@
         <w:pStyle w:val="BodyText"/>
       </w:pPr>
       <w:r>
-        <w:t xml:space="preserve">The survey files describe sellers in one year, not businesses followed over time. No business identifier links the files, so the thesis cannot follow a seller from one round to the next, and returning sellers cannot be ruled out. Revenue appears only in brackets, and only in the 2021 and 2023 files, which describe 2020 and 2022, so value shares are ranges. The 2024 file, which describes 2023, has no revenue amounts. At the top, sellers with sales above about US$3.4 million a year rest on 19 sample rows in the survey for 2022, yet they hold 18 to 39 percent of the marketplace value.</w:t>
+        <w:t xml:space="preserve">The survey files describe sellers in one year, not businesses followed over time. No business identifier links the files, so the thesis cannot follow a seller from one round to the next, and returning sellers cannot be ruled out. Revenue appears only in brackets, and only in the 2021 and 2023 files, which describe 2020 and 2022, so value shares are ranges. The 2024 file, which describes 2023, has no revenue amounts. At the top, sellers with sales above about US$3.4 million a year rest on 19 sample rows in the survey for 2022. Yet they hold 18 to 39 percent of the marketplace value.</w:t>
       </w:r>
     </w:p>
     <w:p>
@@ -9302,8 +10201,8 @@
         <w:t xml:space="preserve">Three of the sources are licensed: the BPS survey files, the LSEG market values and the World Bank survey files. The repository holds the code and the national totals, and anyone who obtains the same files can rerun the analysis. The evidence concerns Indonesia, with regional series labelled as such.</w:t>
       </w:r>
     </w:p>
-    <w:bookmarkEnd w:id="87"/>
-    <w:bookmarkStart w:id="88" w:name="next-steps"/>
+    <w:bookmarkEnd w:id="88"/>
+    <w:bookmarkStart w:id="89" w:name="next-steps"/>
     <w:p>
       <w:pPr>
         <w:pStyle w:val="Heading2"/>
@@ -9368,9 +10267,9 @@
         <w:t xml:space="preserve">The thesis began with figures that moved apart in 2023. BPS’s online sales rose by about 41 percent while Bank Indonesia’s measure fell by about 5 percent, and Tokopedia’s revenue rose while its transaction value fell. The figures disagreed because they measure different things. Revenue is what a platform keeps. Bank Indonesia’s figure comes from large e-commerce firms, and BPS’s survey counts the sellers it reaches. Each stops standing for another once a take rate or a survey’s reach changes. A reader who checks which condition holds can use any of them.</w:t>
       </w:r>
     </w:p>
-    <w:bookmarkEnd w:id="88"/>
     <w:bookmarkEnd w:id="89"/>
-    <w:bookmarkStart w:id="100" w:name="appendices"/>
+    <w:bookmarkEnd w:id="90"/>
+    <w:bookmarkStart w:id="101" w:name="appendices"/>
     <w:p>
       <w:pPr>
         <w:pStyle w:val="Heading1"/>
@@ -9387,7 +10286,7 @@
         <w:t xml:space="preserve">These appendices hold the detail that the main text points to. Every number comes from a table in the project’s repository, named in the notes in small type. Nothing here changes a result in Chapter 5.</w:t>
       </w:r>
     </w:p>
-    <w:bookmarkStart w:id="94" w:name="X190ea442f22e8dfb253327d946eb3313b4f8b85"/>
+    <w:bookmarkStart w:id="95" w:name="X190ea442f22e8dfb253327d946eb3313b4f8b85"/>
     <w:p>
       <w:pPr>
         <w:pStyle w:val="Heading2"/>
@@ -9396,7 +10295,7 @@
         <w:t xml:space="preserve">Appendix A. Platforms, windows and the wedge by year</w:t>
       </w:r>
     </w:p>
-    <w:bookmarkStart w:id="90" w:name="a.1-the-foreign-group-27-platforms"/>
+    <w:bookmarkStart w:id="91" w:name="a.1-the-foreign-group-27-platforms"/>
     <w:p>
       <w:pPr>
         <w:pStyle w:val="Heading3"/>
@@ -10862,8 +11761,8 @@
         <w:t xml:space="preserve">Left out after examination: Dingdong, JD.com, Jumei, Liquidity Services, Newegg and Vipshop, because their own goods are most of revenue in every year; and four platforms that disclose no transaction value (tickers NBIS, TCOM, TOUR and UXIN).</w:t>
       </w:r>
     </w:p>
-    <w:bookmarkEnd w:id="90"/>
-    <w:bookmarkStart w:id="91" w:name="a.2-the-indonesian-and-regional-group"/>
+    <w:bookmarkEnd w:id="91"/>
+    <w:bookmarkStart w:id="92" w:name="a.2-the-indonesian-and-regional-group"/>
     <w:p>
       <w:pPr>
         <w:pStyle w:val="Heading3"/>
@@ -11189,8 +12088,8 @@
         </w:tc>
       </w:tr>
     </w:tbl>
-    <w:bookmarkEnd w:id="91"/>
-    <w:bookmarkStart w:id="92" w:name="X773f7b8c3d425b72b076696eb5a46fa11f89097"/>
+    <w:bookmarkEnd w:id="92"/>
+    <w:bookmarkStart w:id="93" w:name="X773f7b8c3d425b72b076696eb5a46fa11f89097"/>
     <w:p>
       <w:pPr>
         <w:pStyle w:val="Heading3"/>
@@ -12071,8 +12970,8 @@
         <w:t xml:space="preserve">): gross revenue 8,143,239 to 8,988,909; incentives 4,112,320 to 2,813,719; net revenue 4,030,919 to 6,175,190. Net revenue rose by 2,144,271, of which lower incentives account for 60.6 percent and higher gross revenue for 39.4 percent (about 60 and 40 percent in the text).</w:t>
       </w:r>
     </w:p>
-    <w:bookmarkEnd w:id="92"/>
-    <w:bookmarkStart w:id="93" w:name="Xb702da1138b9cc3d1e10d1a4085988b12c1d217"/>
+    <w:bookmarkEnd w:id="93"/>
+    <w:bookmarkStart w:id="94" w:name="Xb702da1138b9cc3d1e10d1a4085988b12c1d217"/>
     <w:p>
       <w:pPr>
         <w:pStyle w:val="Heading3"/>
@@ -13886,9 +14785,9 @@
         </w:tc>
       </w:tr>
     </w:tbl>
-    <w:bookmarkEnd w:id="93"/>
     <w:bookmarkEnd w:id="94"/>
-    <w:bookmarkStart w:id="97" w:name="appendix-b.-the-checks-on-the-test-of-h1"/>
+    <w:bookmarkEnd w:id="95"/>
+    <w:bookmarkStart w:id="98" w:name="appendix-b.-the-checks-on-the-test-of-h1"/>
     <w:p>
       <w:pPr>
         <w:pStyle w:val="Heading2"/>
@@ -13897,7 +14796,7 @@
         <w:t xml:space="preserve">Appendix B. The checks on the test of H1</w:t>
       </w:r>
     </w:p>
-    <w:bookmarkStart w:id="95" w:name="b.1-the-checks"/>
+    <w:bookmarkStart w:id="96" w:name="b.1-the-checks"/>
     <w:p>
       <w:pPr>
         <w:pStyle w:val="Heading3"/>
@@ -15664,8 +16563,8 @@
         <w:t xml:space="preserve">): median yearly change 1.01 points in the Indonesian and regional group and 0.98 points in the foreign group (26 platforms), Mann–Whitney p = 0.65; median share kept 1.59 percent against 16.93 percent.</w:t>
       </w:r>
     </w:p>
-    <w:bookmarkEnd w:id="95"/>
-    <w:bookmarkStart w:id="96" w:name="X37cde8a079398bfdfe609378b26a4d5794a5319"/>
+    <w:bookmarkEnd w:id="96"/>
+    <w:bookmarkStart w:id="97" w:name="X37cde8a079398bfdfe609378b26a4d5794a5319"/>
     <w:p>
       <w:pPr>
         <w:pStyle w:val="Heading3"/>
@@ -15720,9 +16619,9 @@
         <w:t xml:space="preserve">).</w:t>
       </w:r>
     </w:p>
-    <w:bookmarkEnd w:id="96"/>
     <w:bookmarkEnd w:id="97"/>
-    <w:bookmarkStart w:id="98" w:name="X67e1483049b7627842872d160395e7f1a5f4538"/>
+    <w:bookmarkEnd w:id="98"/>
+    <w:bookmarkStart w:id="99" w:name="X67e1483049b7627842872d160395e7f1a5f4538"/>
     <w:p>
       <w:pPr>
         <w:pStyle w:val="Heading2"/>
@@ -16986,8 +17885,8 @@
         </w:tc>
       </w:tr>
     </w:tbl>
-    <w:bookmarkEnd w:id="98"/>
-    <w:bookmarkStart w:id="99" w:name="X56fa97cf87489981fe5725fdfbc87abe7437ddf"/>
+    <w:bookmarkEnd w:id="99"/>
+    <w:bookmarkStart w:id="100" w:name="X56fa97cf87489981fe5725fdfbc87abe7437ddf"/>
     <w:p>
       <w:pPr>
         <w:pStyle w:val="Heading2"/>
@@ -17139,9 +18038,9 @@
         <w:t xml:space="preserve">). In each figure, a legend or label names every colour.</w:t>
       </w:r>
     </w:p>
-    <w:bookmarkEnd w:id="99"/>
     <w:bookmarkEnd w:id="100"/>
-    <w:bookmarkStart w:id="101" w:name="references"/>
+    <w:bookmarkEnd w:id="101"/>
+    <w:bookmarkStart w:id="102" w:name="references"/>
     <w:p>
       <w:pPr>
         <w:pStyle w:val="Heading1"/>
@@ -18596,7 +19495,7 @@
         <w:t xml:space="preserve">(Studies in Methods, Series F). United Nations. https://doi.org/10.18356/9789211073225 [UNVERIFIED: full list of co-issuing organisations]</w:t>
       </w:r>
     </w:p>
-    <w:bookmarkEnd w:id="101"/>
+    <w:bookmarkEnd w:id="102"/>
     <w:sectPr/>
   </w:body>
 </w:document>

</xml_diff>

<commit_message>
Verify references at primary sources; page-by-page fixes to the reading copy
References: 15 flagged entries checked (6 verified, 8 corrected, 2 cited
through named secondary sources); missing entries added for the exchange
rate and Momentum Works figures; in-text keys aligned. Reading copy read
at full size: tickers named in A.1, Figure 5.3 moved, Ch7 trimmed to end
cleanly. 60 pages.

Co-Authored-By: Claude Opus 5.5 <noreply@anthropic.com>
Claude-Session: https://claude.ai/code/session_01XxH9J9TaLYfAYFCaGAqS9y
</commit_message>
<xml_diff>
--- a/papers/thesis_2026-10/reading/thesis_editing_copy_2026-10-16.docx
+++ b/papers/thesis_2026-10/reading/thesis_editing_copy_2026-10-16.docx
@@ -114,15 +114,15 @@
         <w:pStyle w:val="BodyText"/>
       </w:pPr>
       <w:r>
-        <w:t xml:space="preserve">Revenue shows only a small part of the commerce. In 2023, three major platforms in Indonesia kept about US$3 billion of the US$43 billion that passed through them. Revenue also stopped tracking the commerce when platforms changed the share of each sale they kept. Between 2022 and 2024, Indonesian and regional platforms changed that share about three times as much as 27 platforms abroad. So the hypothesis that revenue grows in proportion to the commerce is rejected.</w:t>
-      </w:r>
-    </w:p>
-    <w:p>
-      <w:pPr>
-        <w:pStyle w:val="BodyText"/>
-      </w:pPr>
-      <w:r>
-        <w:t xml:space="preserve">The national count of online sellers rose by 27 percent in 2023. A test registered before the survey files were opened shows that first-time entry explains only about half of that rise. More businesses account for most of the growth in online sales on the published figures. If the rest of the rise is read as wider survey coverage, that conclusion sits on its threshold.</w:t>
+        <w:t xml:space="preserve">Revenue shows only a small part of the commerce. In 2023, three major platforms in Indonesia kept about US$3 billion of the US$43 billion that passed through them. Revenue also stopped tracking the commerce when platforms changed the share of each sale they kept. Indonesian and regional platforms changed that share about three times as much as 27 platforms abroad. Most of their large changes came between 2022 and 2024. So the hypothesis that revenue grows in proportion to the commerce is rejected.</w:t>
+      </w:r>
+    </w:p>
+    <w:p>
+      <w:pPr>
+        <w:pStyle w:val="BodyText"/>
+      </w:pPr>
+      <w:r>
+        <w:t xml:space="preserve">The national count of online sellers rose by 27 percent in 2023. A test registered before the survey files were opened finds too few new sellers to produce that rise. A later, exploratory count shows that first-time entry explains only about half of it. More businesses account for most of the growth in online sales on the published figures. If the rest of the rise is read as wider survey coverage, that conclusion sits on its threshold.</w:t>
       </w:r>
     </w:p>
     <w:p>
@@ -1085,7 +1085,7 @@
         <w:pStyle w:val="BodyText"/>
       </w:pPr>
       <w:r>
-        <w:t xml:space="preserve">In 2023, traders at Tanah Abang, a major wholesale market in Jakarta, said their customers had moved to sellers on TikTok Shop (AFP 2023). The government then banned transactions on social media platforms, and TikTok Shop closed in Indonesia soon after (Ministry of Trade of the Republic of Indonesia 2023; Mandagie 2023). That year the national statistics office, BPS, reported that online sales rose by about 41 percent (BPS 2025a). The central bank’s measure of online shopping fell by about 5 percent (Bank Indonesia 2023; KabarBursa 2024). The two official figures moved in opposite directions.</w:t>
+        <w:t xml:space="preserve">In 2023, traders at Tanah Abang, a major wholesale market in Jakarta, said their customers had moved to sellers on TikTok Shop (Agence France-Presse 2023). The government then banned transactions on social media platforms, and TikTok Shop closed in Indonesia soon after (Ministry of Trade of the Republic of Indonesia 2023; Mandagie 2023). That year the national statistics office, BPS, reported that online sales rose by about 41 percent (BPS 2025a). The central bank’s measure of online shopping fell by about 5 percent (Bank Indonesia 2023; KabarBursa 2024). The two official figures moved in opposite directions.</w:t>
       </w:r>
     </w:p>
     <w:p>
@@ -1328,7 +1328,7 @@
         <w:pStyle w:val="BodyText"/>
       </w:pPr>
       <w:r>
-        <w:t xml:space="preserve">Official statistics address the question in two ways. National accounts separate the sale between a buyer and a seller from the platform’s fee, and they count only the fee as the platform’s output (Ahmad and Schreyer 2016; International Monetary Fund 2018; Organisation for Economic Co-operation and Development [OECD] 2023; United Nations et al. 2025). Research on measurement also offers a method: test a figure against the activity it stands for, as studies of night-time lights do for national income (Henderson, Storeygard and Weil 2012). Growth in online sales can be split in the same spirit, into more sales by existing sellers and more sellers entering. Trade economists split a country’s exports in this way, into more of each good and more kinds of goods (Hummels and Klenow 2005).</w:t>
+        <w:t xml:space="preserve">Official statistics address the question in two ways. National accounts separate the sale between a buyer and a seller from the platform’s fee, and they count only the fee as the platform’s output (Ahmad and Schreyer 2016; International Monetary Fund 2018; Organisation for Economic Co-operation and Development [OECD] 2023; European Commission et al. 2025). Research on measurement also offers a method: test a figure against the activity it stands for, as studies of night-time lights do for national income (Henderson, Storeygard and Weil 2012). Growth in online sales can be split in the same spirit, into more sales by existing sellers and more sellers entering. Trade economists split a country’s exports in this way, into more of each good and more kinds of goods (Hummels and Klenow 2005).</w:t>
       </w:r>
     </w:p>
     <w:p>
@@ -3961,7 +3961,7 @@
         <w:pStyle w:val="BodyText"/>
       </w:pPr>
       <w:r>
-        <w:t xml:space="preserve">Platform-years are compared in pairs, and three rules keep the pairs comparable. Two consecutive platform-years form a pair, and nothing else does. A missing year stays missing and is never filled in. Annual and quarterly pairs are never pooled. A take rate is a ratio of two amounts in one currency, so the tests need no exchange rate. Amounts in running text are in US dollars at the World Bank’s average rate for the year.</w:t>
+        <w:t xml:space="preserve">Platform-years are compared in pairs, and three rules keep the pairs comparable. Two consecutive platform-years form a pair, and nothing else does. A missing year stays missing and is never filled in. Annual and quarterly pairs are never pooled. A take rate is a ratio of two amounts in one currency, so the tests need no exchange rate. Amounts in running text are in US dollars at the World Bank’s average rate for the year (World Bank 2026).</w:t>
       </w:r>
     </w:p>
     <w:p>
@@ -4770,7 +4770,7 @@
               <w:jc w:val="left"/>
             </w:pPr>
             <w:r>
-              <w:t xml:space="preserve">Shopping marketplaces in Indonesia or Southeast Asia, from the research firm Momentum Works (2024) and the e-Conomy report (Google, Temasek and Bain 2024)</w:t>
+              <w:t xml:space="preserve">Shopping marketplaces in Indonesia or Southeast Asia, from the research firm Momentum Works (2024), as quoted by Setyowati (2024), and the e-Conomy report (Google, Temasek and Bain 2024)</w:t>
             </w:r>
           </w:p>
         </w:tc>
@@ -4884,7 +4884,7 @@
               <w:jc w:val="left"/>
             </w:pPr>
             <w:r>
-              <w:t xml:space="preserve">Parcels shipped in Southeast Asia, the value-added tax collected on foreign digital services (Directorate General of Taxes n.d.), and the number of merchants a company reports</w:t>
+              <w:t xml:space="preserve">Parcels shipped in Southeast Asia, the value-added tax collected on foreign digital services (Directorate General of Taxes 2025), and the number of merchants a company reports</w:t>
             </w:r>
           </w:p>
         </w:tc>
@@ -6259,7 +6259,7 @@
         <w:t xml:space="preserve"> </w:t>
       </w:r>
       <w:r>
-        <w:t xml:space="preserve">Rounded amounts may not add. With Shopee’s take rate at 9 or 11 percent, the total wedge is US$40.3 or US$39.9 billion; at Sea’s company-wide rate of 11.5 percent, it is US$39.8 billion. Source: company filings; Momentum Works (2024); author’s calculations.</w:t>
+        <w:t xml:space="preserve">Rounded amounts may not add. With Shopee’s take rate at 9 or 11 percent, the total wedge is US$40.3 or US$39.9 billion; at Sea’s company-wide rate of 11.5 percent, it is US$39.8 billion. Source: company filings; Momentum Works (2024), as quoted by Setyowati (2024); author’s calculations.</w:t>
       </w:r>
     </w:p>
     <w:p>
@@ -6737,7 +6737,7 @@
         <w:pStyle w:val="BodyText"/>
       </w:pPr>
       <w:r>
-        <w:t xml:space="preserve">A narrower test, set before the wider one, compares the three Indonesian marketplaces with the eight foreign platforms chosen first. It points the same way. With one median per platform, the Mann–Whitney test rejects equal moves (p = 0.024). A shuffle of platform labels on pairs of years comes close without passing (p = 0.06), since three platforms give a test little power. In that sample, revenue growth and transaction value growth had a correlation of 0.10 in Indonesia and 0.98 abroad, excluding Sea.</w:t>
+        <w:t xml:space="preserve">A narrower test, set before the wider one, compares the three Indonesian marketplaces with the eight foreign platforms chosen first. It points the same way. With one median per platform, the Mann–Whitney test rejects equal moves (p = 0.024). A shuffle of platform labels, using one median per platform, comes close without passing (p = 0.06), since three platforms give a test little power. In that sample, revenue growth and transaction value growth had a correlation of 0.10 in Indonesia and 0.98 abroad, excluding Sea.</w:t>
       </w:r>
     </w:p>
     <w:p>
@@ -6761,7 +6761,7 @@
         <w:pStyle w:val="BodyText"/>
       </w:pPr>
       <w:r>
-        <w:t xml:space="preserve">The large moves were not simply a mark of young platforms, an exploratory check. The Indonesian and regional platforms made their largest moves one or two years after listing on the stock market. Foreign platforms, by contrast, did not move their take rates more in their first three years after listing than later (median 0.07 against 0.08, p = 0.24). Nor did foreign platforms in lower-income markets move more in 2022 to 2024: one of seven did, against all four Indonesian and regional platforms with enough years. The repricing was an Indonesian and regional episode of those years.</w:t>
+        <w:t xml:space="preserve">The large moves were not simply a mark of young platforms, an exploratory check. The Indonesian and regional platforms made their largest moves one or two years after listing on the stock market. Foreign platforms, by contrast, did not move their take rates more in their first three years after listing than later (median 0.07 against 0.08, p = 0.24). This comparison uses the 15 foreign platforms with years in both periods. Nor did foreign platforms in lower-income markets move more in 2022 to 2024: one of seven did, against all four Indonesian and regional platforms with enough years. The repricing was an Indonesian and regional episode of those years.</w:t>
       </w:r>
     </w:p>
     <w:p>
@@ -7577,6 +7577,14 @@
         <w:pStyle w:val="BodyText"/>
       </w:pPr>
       <w:r>
+        <w:t xml:space="preserve">Sellers’ own accounts of their sales show no boom either, a registered result. BPS asks each business how its online sales changed. For businesses already selling, the registered prediction set an upper limit on the median change. The limit was about 10 percent, the published growth in sales per business. The median change was zero.</w:t>
+      </w:r>
+    </w:p>
+    <w:p>
+      <w:pPr>
+        <w:pStyle w:val="BodyText"/>
+      </w:pPr>
+      <w:r>
         <w:drawing>
           <wp:inline>
             <wp:extent cx="5334000" cy="2862754"/>
@@ -7642,14 +7650,6 @@
         <w:pStyle w:val="BodyText"/>
       </w:pPr>
       <w:r>
-        <w:t xml:space="preserve">Sellers’ own accounts of their sales show no boom either, a registered result. BPS asks each business how its online sales changed. For businesses already selling, the registered prediction set an upper limit on the median change. The limit was about 10 percent, the published growth in sales per business. The median change was zero.</w:t>
-      </w:r>
-    </w:p>
-    <w:p>
-      <w:pPr>
-        <w:pStyle w:val="BodyText"/>
-      </w:pPr>
-      <w:r>
         <w:t xml:space="preserve">Fewer sellers reported a rise than a year earlier. About a quarter reported a rise and about a third a fall. A year before, more than a third had reported a rise and a quarter a fall. The mean change was about −4 percent. Lack of demand became the main obstacle, named by 41 percent of sellers against 35 percent in 2022. The published count of online sellers nonetheless rose by 27 percent in 2023. A rise of that size, in a year without a boom in sales, needs explaining.</w:t>
       </w:r>
     </w:p>
@@ -8300,15 +8300,15 @@
         <w:pStyle w:val="BodyText"/>
       </w:pPr>
       <w:r>
-        <w:t xml:space="preserve">Levels cannot be reconciled. In 2024, BPS put online sales at about US$81 billion and Bank Indonesia at about US$31 billion. In 2023, BPS’s marketplace slice was about US$13 billion, against about US$38 billion for Tokopedia and the Shopee estimate together. In 2024 it was less than a quarter of Momentum Works’ marketplace estimate of about US$57 billion.</w:t>
-      </w:r>
-    </w:p>
-    <w:p>
-      <w:pPr>
-        <w:pStyle w:val="BodyText"/>
-      </w:pPr>
-      <w:r>
-        <w:t xml:space="preserve">Platform figures and the seller survey count different things. Platform transaction value includes shipping, digital goods, travel and offline sales that a seller survey does not count in the same way. The counts of sellers differ too. Tokopedia alone said that it had more than 14 million merchants in 2023, while BPS counted about 0.7 million marketplace sellers that year (GoTo Gojek Tokopedia 2024b).</w:t>
+        <w:t xml:space="preserve">Levels cannot be reconciled. In 2024, BPS put online sales at about US$81 billion and Bank Indonesia at about US$31 billion. In 2023, BPS’s marketplace slice was about US$13 billion, against about US$38 billion for Tokopedia and the Shopee estimate together. In 2024 it was less than a quarter of Momentum Works’ marketplace estimate of about US$57 billion (Setyowati 2025).</w:t>
+      </w:r>
+    </w:p>
+    <w:p>
+      <w:pPr>
+        <w:pStyle w:val="BodyText"/>
+      </w:pPr>
+      <w:r>
+        <w:t xml:space="preserve">Platform figures and the seller survey count different things. Platform transaction value includes shipping, digital goods, travel and offline sales that a seller survey does not count in the same way. The counts of sellers differ too. Tokopedia alone reported more than 14 million merchants in 2023 (GoTo Gojek Tokopedia 2024b). The survey files put marketplace sellers at about 0.7 million that year, on the author’s calculation.</w:t>
       </w:r>
     </w:p>
     <w:p>
@@ -8912,7 +8912,7 @@
         <w:t xml:space="preserve"> </w:t>
       </w:r>
       <w:r>
-        <w:t xml:space="preserve">At the 2024 rate, Rp500 million is about US$32,000 and Rp4.8 billion about US$300,000. Section 4.8 converts the exemption at the 2022 rate, about US$34,000, to match the survey year. Source: the legal texts; news reports where marked.</w:t>
+        <w:t xml:space="preserve">At the 2024 rate, Rp500 million is about US$32,000 and Rp4.8 billion about US$300,000. Section 4.8 converts the exemption at the 2022 rate, about US$34,000, to match the survey year. Sources: the legal texts (BPS-Statistics Indonesia 2023; Government of the Republic of Indonesia 2026; Ministry of Finance of the Republic of Indonesia 2025; Ministry of Trade of the Republic of Indonesia 2023, 2026). The texts behind the commission cap were not public; its terms come from GoTo Gojek Tokopedia (2026) and CNN Indonesia (2026b).</w:t>
       </w:r>
     </w:p>
     <w:p>
@@ -8978,7 +8978,7 @@
         <w:pStyle w:val="BodyText"/>
       </w:pPr>
       <w:r>
-        <w:t xml:space="preserve">The arithmetic of the cap shows how small that slice is. At Grab, the cut from 20 to 8 percent applies to trips worth about 2 percent of on-demand transaction value. If nothing else changes, it lowers the on-demand take rate by at most about a quarter of a point. Grab’s on-demand take rate is about 13 percent. At GoTo, where two-wheel rides weigh more, the same arithmetic gives about 1 to 1.4 points on a take rate of about 22 percent. In both cases the wedge grows by the same amount. The cap moves money from the platform’s revenue to the drivers’ fares, inside the same transaction value.</w:t>
+        <w:t xml:space="preserve">The arithmetic of the cap shows how small that slice is. At Grab, the cut from 20 to 8 percent applies to trips worth about 2 percent of on-demand transaction value. If nothing else changes, it lowers the on-demand take rate by at most about a quarter of a point. Grab’s on-demand take rate was about 13 percent in the second quarter of 2026. At GoTo, where two-wheel rides weigh more, the same arithmetic gives at most about 1.4 points on a take rate of about 22 percent. GoTo’s own cost estimate implies about 0.9 points. In both cases the wedge grows by the same amount. The cap moves money from the platform’s revenue to the drivers’ fares, inside the same transaction value.</w:t>
       </w:r>
     </w:p>
     <w:p>
@@ -9054,7 +9054,7 @@
         <w:pStyle w:val="BodyText"/>
       </w:pPr>
       <w:r>
-        <w:t xml:space="preserve">Marketplace fees moved the other way. Shopee, Tokopedia and TikTok Shop added a fixed fee to every order in mid-2025 (Islamiati 2025). In 2026, Shopee and TikTok Shop, which took over Tokopedia in 2024, raised their seller fees again (CNN Indonesia 2026a; Setyowati 2026). The government declined to cap these fees. It later required marketplaces to halve the service fee for small sellers of local products who apply for the discount (Ayudiana 2026). The rules on the take rate cap one fee on one ride-hailing service and leave the largest marketplace fees free. What the companies’ take rates did after the cap is the subject of the predictions in Section 6.5.</w:t>
+        <w:t xml:space="preserve">Marketplace fees moved the other way. Shopee, Tokopedia and TikTok Shop added a fixed fee to every order in mid-2025 (Islamiati 2025). In 2026, Shopee and TikTok Shop, which took over Tokopedia in 2024, raised their seller fees again (CNN Indonesia 2026a; Setyowati 2026). The government declined to cap these fees. It later required marketplaces to halve the service fee for small sellers of local products (Ayudiana 2026). The rules on the take rate cap one fee on one ride-hailing service and leave the largest marketplace fees free. What the companies’ take rates did after the cap is the subject of the predictions in Section 6.5.</w:t>
       </w:r>
     </w:p>
     <w:bookmarkEnd w:id="79"/>
@@ -9992,23 +9992,23 @@
         <w:pStyle w:val="BodyText"/>
       </w:pPr>
       <w:r>
-        <w:t xml:space="preserve">The answer to the second half differs by link. On the inner link, the choice of revenue changed the conclusion between 2022 and 2024. The Indonesian and regional platforms changed their take rates about three times as much as platforms abroad, measured against the take rate itself, so H1 is rejected. They keep a much thinner share of each sale, so price changes of a similar size in points moved their revenue far more. In the windows traced, pricing moved revenue more than commerce did.</w:t>
-      </w:r>
-    </w:p>
-    <w:p>
-      <w:pPr>
-        <w:pStyle w:val="BodyText"/>
-      </w:pPr>
-      <w:r>
-        <w:t xml:space="preserve">On the outer link, H2 holds on BPS’s published figures: more businesses account for most of the growth in online sales value. The registered entry test failed, and about half of the 2023 rise in the count is not explained by first-time entry. The extra count leaned toward long-running businesses. Read as wider coverage, it leaves H2 on its threshold. With those sellers and their sales taken out, more businesses account for about 42 to 54 percent of the growth, against the 50 percent H2 requires. In the same year, five of six measures of buying through platforms grew more slowly than household spending, and the median seller already online reported no change in sales. Reading BPS’s 2023 figures as a boom in online selling overstates what sellers and platforms reported.</w:t>
-      </w:r>
-    </w:p>
-    <w:p>
-      <w:pPr>
-        <w:pStyle w:val="BodyText"/>
-      </w:pPr>
-      <w:r>
-        <w:t xml:space="preserve">The national figures agree that growth was small where they cover the same sellers. They part outside the marketplaces, among the chat and social sellers that only BPS reaches. The figure a reader picks decides whether 2023 looks like a stall or a boom. Market value, for its part, moved with transaction value, and the data do not show that markets valued growth from pricing any less.</w:t>
+        <w:t xml:space="preserve">The answer to the second half differs by link. On the inner link, the choice of revenue changed the conclusion, above all from 2022 to 2024. The Indonesian and regional platforms changed their take rates about three times as much as platforms abroad, measured against the take rate itself, so H1 is rejected. They keep a much thinner share of each sale, so price changes of a similar size in points moved their revenue far more. In the windows traced, pricing moved revenue more than commerce did.</w:t>
+      </w:r>
+    </w:p>
+    <w:p>
+      <w:pPr>
+        <w:pStyle w:val="BodyText"/>
+      </w:pPr>
+      <w:r>
+        <w:t xml:space="preserve">On the outer link, H2 holds on BPS’s published figures: more businesses account for most of the growth in online sales value. The registered entry test failed, and about half of the 2023 rise in the count is not explained by first-time entry. The extra count leaned toward long-running businesses. Read as wider coverage, an exploratory check, the extra count leaves H2 on its threshold. With those sellers and their sales taken out, more businesses account for about 42 to 54 percent of the growth, against the 50 percent H2 requires. In the same year, five of six measures of buying through platforms grew more slowly than household spending, and the median seller already online reported no change in sales. Reading BPS’s 2023 figures as a boom in online selling overstates what sellers and platforms reported.</w:t>
+      </w:r>
+    </w:p>
+    <w:p>
+      <w:pPr>
+        <w:pStyle w:val="BodyText"/>
+      </w:pPr>
+      <w:r>
+        <w:t xml:space="preserve">Where the national figures cover the same sellers, they agree on small growth in two of three scenarios. They part outside the marketplaces, among the chat and social sellers that only BPS reaches. The figure a reader picks decides whether 2023 looks like a stall or a boom. Market value, for its part, moved with transaction value, and the data do not show that markets valued growth from pricing any less.</w:t>
       </w:r>
     </w:p>
     <w:bookmarkEnd w:id="85"/>
@@ -10026,7 +10026,7 @@
         <w:pStyle w:val="FirstParagraph"/>
       </w:pPr>
       <w:r>
-        <w:t xml:space="preserve">For investors, the thesis adds a check that can be run on any platform that reports both amounts. Revenue growth splits into more commerce and a larger take rate with two public figures (equation (5)). In Indonesia, the take rate accounted for about two thirds of a revenue move at the typical pair, against about a quarter abroad. The thinner the take rate, the more a small change in fees or incentives moves revenue growth. The same split shows when market value per dollar of revenue and per dollar of commerce will disagree. Across 28 listed platforms, market value moved with transaction value, as a registered prediction stated. A 1 percent rise in transaction value went with about 0.6 percent more market value. Earlier studies used web traffic as the measure of activity; here it is the transaction value that platforms report themselves.</w:t>
+        <w:t xml:space="preserve">For investors, the thesis adds a check that can be run on any platform that reports both amounts. Revenue growth splits into more commerce and a larger take rate with two public figures (equation (5)). At the Indonesian and regional platforms, the take rate accounted for about two thirds of a revenue move at the typical pair. Abroad it accounted for about a quarter. The thinner the take rate, the more a small change in fees or incentives moves revenue growth. The same split shows when market value per dollar of revenue and per dollar of commerce will disagree. Across 28 listed platforms, market value moved with transaction value, as a registered prediction stated. A 1 percent rise in transaction value went with about 0.6 percent more market value. Earlier studies used web traffic as the measure of activity; here it is the transaction value that platforms report themselves.</w:t>
       </w:r>
     </w:p>
     <w:p>
@@ -10198,7 +10198,7 @@
         <w:pStyle w:val="BodyText"/>
       </w:pPr>
       <w:r>
-        <w:t xml:space="preserve">Three of the sources are licensed: the BPS survey files, the LSEG market values and the World Bank survey files. The repository holds the code and the national totals, and anyone who obtains the same files can rerun the analysis. The evidence concerns Indonesia, with regional series labelled as such.</w:t>
+        <w:t xml:space="preserve">The licensed files stay outside the repository, which holds the code and national totals (Section 4.10). The evidence concerns Indonesia, with regional series labelled as such.</w:t>
       </w:r>
     </w:p>
     <w:bookmarkEnd w:id="88"/>
@@ -10248,15 +10248,7 @@
         <w:pStyle w:val="BodyText"/>
       </w:pPr>
       <w:r>
-        <w:t xml:space="preserve">The platform sample can grow as well. Lazada and TikTok Shop can join the test of H1 once they report Indonesian revenue and transaction value.</w:t>
-      </w:r>
-    </w:p>
-    <w:p>
-      <w:pPr>
-        <w:pStyle w:val="BodyText"/>
-      </w:pPr>
-      <w:r>
-        <w:t xml:space="preserve">The last step takes the channel count abroad. Any country whose statistics office asks sellers which channels they use can measure how much online selling its platform rules reach.</w:t>
+        <w:t xml:space="preserve">The platform sample can grow as well: Lazada and TikTok Shop can join the test of H1 once they report Indonesian figures. The last step takes the channel count abroad. Any country whose statistics office asks sellers which channels they use can measure how much online selling its platform rules reach.</w:t>
       </w:r>
     </w:p>
     <w:p>
@@ -11758,7 +11750,7 @@
         <w:pStyle w:val="BodyText"/>
       </w:pPr>
       <w:r>
-        <w:t xml:space="preserve">Left out after examination: Dingdong, JD.com, Jumei, Liquidity Services, Newegg and Vipshop, because their own goods are most of revenue in every year; and four platforms that disclose no transaction value (tickers NBIS, TCOM, TOUR and UXIN).</w:t>
+        <w:t xml:space="preserve">Left out after examination: Dingdong, JD.com, Jumei, Liquidity Services, Newegg and Vipshop, because their own goods are most of revenue in every year; and four platforms that disclose no transaction value (Nebius Group, formerly Yandex; Trip.com; Tuniu; and Uxin).</w:t>
       </w:r>
     </w:p>
     <w:bookmarkEnd w:id="91"/>
@@ -12985,7 +12977,7 @@
         <w:pStyle w:val="FirstParagraph"/>
       </w:pPr>
       <w:r>
-        <w:t xml:space="preserve">Original currency and units, as in the filings: Rp million for Tokopedia and Bukalapak, Rp billion for Blibli, and US$ billion for Grab and Shopee, whose Indonesian amounts are derived or estimated. Shopee’s revenue assumes a take rate of 8.4 percent in 2022, 10 percent in 2023 and 10.8 percent in 2024. Table 5.2 converts Tokopedia’s 2023 rupiah amounts to US dollars. Take rate and ecosystem ratio carry no currency. Source:</w:t>
+        <w:t xml:space="preserve">Original currency and units, as in the filings: Rp million for Tokopedia and Bukalapak, Rp billion for Blibli, and US$ billion for Grab and Shopee, whose Indonesian amounts are derived or estimated. Shopee’s revenue assumes a take rate of 8.4 percent in 2022, 10 percent in 2023 and 10.8 percent in 2024. Table 5.2 converts Tokopedia’s 2023 rupiah amounts to US dollars. Take rate and ecosystem ratio carry no currency. Each label names the source of the transaction value and of the revenue in that row. Source:</w:t>
       </w:r>
       <w:r>
         <w:t xml:space="preserve"> </w:t>
@@ -13211,7 +13203,7 @@
               <w:jc w:val="left"/>
             </w:pPr>
             <w:r>
-              <w:t xml:space="preserve">Derived value</w:t>
+              <w:t xml:space="preserve">Revenue: country disclosure; value: derived</w:t>
             </w:r>
           </w:p>
         </w:tc>
@@ -13309,7 +13301,7 @@
               <w:jc w:val="left"/>
             </w:pPr>
             <w:r>
-              <w:t xml:space="preserve">Derived value</w:t>
+              <w:t xml:space="preserve">Revenue: country disclosure; value: derived</w:t>
             </w:r>
           </w:p>
         </w:tc>
@@ -13407,7 +13399,7 @@
               <w:jc w:val="left"/>
             </w:pPr>
             <w:r>
-              <w:t xml:space="preserve">Derived value</w:t>
+              <w:t xml:space="preserve">Revenue: country disclosure; value: derived</w:t>
             </w:r>
           </w:p>
         </w:tc>
@@ -13505,7 +13497,7 @@
               <w:jc w:val="left"/>
             </w:pPr>
             <w:r>
-              <w:t xml:space="preserve">Derived value</w:t>
+              <w:t xml:space="preserve">Value: outside estimate; revenue: scenario</w:t>
             </w:r>
           </w:p>
         </w:tc>
@@ -13603,7 +13595,7 @@
               <w:jc w:val="left"/>
             </w:pPr>
             <w:r>
-              <w:t xml:space="preserve">Derived value</w:t>
+              <w:t xml:space="preserve">Value: outside estimate; revenue: scenario</w:t>
             </w:r>
           </w:p>
         </w:tc>
@@ -13701,7 +13693,7 @@
               <w:jc w:val="left"/>
             </w:pPr>
             <w:r>
-              <w:t xml:space="preserve">Derived value</w:t>
+              <w:t xml:space="preserve">Value: outside estimate; revenue: scenario</w:t>
             </w:r>
           </w:p>
         </w:tc>
@@ -13947,7 +13939,7 @@
               <w:jc w:val="left"/>
             </w:pPr>
             <w:r>
-              <w:t xml:space="preserve">122.00</w:t>
+              <w:t xml:space="preserve">122</w:t>
             </w:r>
           </w:p>
         </w:tc>
@@ -13995,7 +13987,7 @@
               <w:jc w:val="left"/>
             </w:pPr>
             <w:r>
-              <w:t xml:space="preserve">Direct disclosure</w:t>
+              <w:t xml:space="preserve">Segment disclosure, includes travel</w:t>
             </w:r>
           </w:p>
         </w:tc>
@@ -14045,7 +14037,7 @@
               <w:jc w:val="left"/>
             </w:pPr>
             <w:r>
-              <w:t xml:space="preserve">199.00</w:t>
+              <w:t xml:space="preserve">199</w:t>
             </w:r>
           </w:p>
         </w:tc>
@@ -14093,7 +14085,7 @@
               <w:jc w:val="left"/>
             </w:pPr>
             <w:r>
-              <w:t xml:space="preserve">Direct disclosure</w:t>
+              <w:t xml:space="preserve">Segment disclosure, includes travel</w:t>
             </w:r>
           </w:p>
         </w:tc>
@@ -14191,7 +14183,7 @@
               <w:jc w:val="left"/>
             </w:pPr>
             <w:r>
-              <w:t xml:space="preserve">Direct disclosure</w:t>
+              <w:t xml:space="preserve">Segment disclosure, includes travel</w:t>
             </w:r>
           </w:p>
         </w:tc>
@@ -14289,7 +14281,7 @@
               <w:jc w:val="left"/>
             </w:pPr>
             <w:r>
-              <w:t xml:space="preserve">Direct disclosure</w:t>
+              <w:t xml:space="preserve">Segment disclosure, includes travel</w:t>
             </w:r>
           </w:p>
         </w:tc>
@@ -14387,7 +14379,7 @@
               <w:jc w:val="left"/>
             </w:pPr>
             <w:r>
-              <w:t xml:space="preserve">Direct disclosure</w:t>
+              <w:t xml:space="preserve">Segment disclosure, includes travel</w:t>
             </w:r>
           </w:p>
         </w:tc>
@@ -14485,7 +14477,7 @@
               <w:jc w:val="left"/>
             </w:pPr>
             <w:r>
-              <w:t xml:space="preserve">Direct disclosure</w:t>
+              <w:t xml:space="preserve">Company-wide disclosure</w:t>
             </w:r>
           </w:p>
         </w:tc>
@@ -14583,7 +14575,7 @@
               <w:jc w:val="left"/>
             </w:pPr>
             <w:r>
-              <w:t xml:space="preserve">Direct disclosure</w:t>
+              <w:t xml:space="preserve">Company-wide disclosure</w:t>
             </w:r>
           </w:p>
         </w:tc>
@@ -14681,7 +14673,7 @@
               <w:jc w:val="left"/>
             </w:pPr>
             <w:r>
-              <w:t xml:space="preserve">Direct disclosure</w:t>
+              <w:t xml:space="preserve">Company-wide disclosure</w:t>
             </w:r>
           </w:p>
         </w:tc>
@@ -14779,7 +14771,7 @@
               <w:jc w:val="left"/>
             </w:pPr>
             <w:r>
-              <w:t xml:space="preserve">Direct disclosure</w:t>
+              <w:t xml:space="preserve">Company-wide disclosure</w:t>
             </w:r>
           </w:p>
         </w:tc>
@@ -18172,15 +18164,15 @@
         <w:t xml:space="preserve"> </w:t>
       </w:r>
       <w:r>
-        <w:t xml:space="preserve">[Economic report on Indonesia 2022]. https://www.bi.go.id/id/publikasi/laporan/Documents/LPI_2022.pdf [UNVERIFIED: release date]</w:t>
-      </w:r>
-    </w:p>
-    <w:p>
-      <w:pPr>
-        <w:pStyle w:val="BodyText"/>
-      </w:pPr>
-      <w:r>
-        <w:t xml:space="preserve">Bank Indonesia. (2025).</w:t>
+        <w:t xml:space="preserve">[Economic report on Indonesia 2022]. https://www.bi.go.id/id/publikasi/laporan/Documents/LPI_2022.pdf</w:t>
+      </w:r>
+    </w:p>
+    <w:p>
+      <w:pPr>
+        <w:pStyle w:val="BodyText"/>
+      </w:pPr>
+      <w:r>
+        <w:t xml:space="preserve">Bank Indonesia. (2025, October 30).</w:t>
       </w:r>
       <w:r>
         <w:t xml:space="preserve"> </w:t>
@@ -18190,13 +18182,13 @@
           <w:iCs/>
           <w:i/>
         </w:rPr>
-        <w:t xml:space="preserve">Sinergi jadi energi saat UMKM naik kelas lewat digitalisasi</w:t>
+        <w:t xml:space="preserve">Sinergi jadi energi: Saat UMKM naik kelas lewat digitalisasi</w:t>
       </w:r>
       <w:r>
         <w:t xml:space="preserve"> </w:t>
       </w:r>
       <w:r>
-        <w:t xml:space="preserve">[Cerita BI]. https://www.bi.go.id/id/publikasi/ruang-media/cerita-bi/Pages/Sinergi-Jadi-Energi-Saat-UMKM-Naik-Kelas-Lewat-Digitalisasi.aspx [UNVERIFIED: exact date; repo notes say 30 Oct 2025]</w:t>
+        <w:t xml:space="preserve">[Synergy becomes energy: When small businesses move up through digitalisation] [Cerita BI]. https://www.bi.go.id/id/publikasi/ruang-media/cerita-bi/Pages/Sinergi-Jadi-Energi-Saat-UMKM-Naik-Kelas-Lewat-Digitalisasi.aspx</w:t>
       </w:r>
     </w:p>
     <w:p>
@@ -18262,7 +18254,7 @@
         <w:t xml:space="preserve"> </w:t>
       </w:r>
       <w:r>
-        <w:t xml:space="preserve">[BPS Regulation No. 4 of 2023 on the submission and management of e-commerce data and/or information]. https://jdih.bps.go.id [UNVERIFIED: document-level URL]</w:t>
+        <w:t xml:space="preserve">[BPS Regulation No. 4 of 2023 on the submission and management of e-commerce data and/or information]. Berita Negara Republik Indonesia Tahun 2023 Nomor 257. https://jdih.bps.go.id</w:t>
       </w:r>
     </w:p>
     <w:p>
@@ -18376,7 +18368,20 @@
         <w:t xml:space="preserve"> </w:t>
       </w:r>
       <w:r>
-        <w:t xml:space="preserve">[Issued December 21, 2023]. Republic of the Philippines. [UNVERIFIED: primary text not retrieved (403); details from GMA News, December 29, 2023, https://www.gmanetwork.com/news/money/economy/892606/bir-subjects-online-sellers-to-1-withholding-tax/story/]</w:t>
+        <w:t xml:space="preserve">[Issued December 21, 2023]. Republic of the Philippines. [Primary text not retrieved; details from Cordero, T. (2023, December 29), BIR subjects online sellers to 1% withholding tax,</w:t>
+      </w:r>
+      <w:r>
+        <w:t xml:space="preserve"> </w:t>
+      </w:r>
+      <w:r>
+        <w:rPr>
+          <w:iCs/>
+          <w:i/>
+        </w:rPr>
+        <w:t xml:space="preserve">GMA News</w:t>
+      </w:r>
+      <w:r>
+        <w:t xml:space="preserve">, https://www.gmanetwork.com/news/money/economy/892606/bir-subjects-online-sellers-to-1-withholding-tax/story/]</w:t>
       </w:r>
     </w:p>
     <w:p>
@@ -18474,7 +18479,7 @@
         <w:pStyle w:val="BodyText"/>
       </w:pPr>
       <w:r>
-        <w:t xml:space="preserve">Directorate General of Taxes. (2026a, July 1).</w:t>
+        <w:t xml:space="preserve">Directorate General of Taxes. (2025, January 20).</w:t>
       </w:r>
       <w:r>
         <w:t xml:space="preserve"> </w:t>
@@ -18484,21 +18489,21 @@
           <w:iCs/>
           <w:i/>
         </w:rPr>
-        <w:t xml:space="preserve">[Designation of four marketplaces as collectors of income tax Article 22]</w:t>
+        <w:t xml:space="preserve">Pajak atas usaha ekonomi digital terkini: 32,32 triliun</w:t>
       </w:r>
       <w:r>
         <w:t xml:space="preserve"> </w:t>
       </w:r>
       <w:r>
-        <w:t xml:space="preserve">[Press release]. Ministry of Finance of the Republic of Indonesia. https://www.pajak.go.id/en/node/120146 [UNVERIFIED: exact title]</w:t>
-      </w:r>
-    </w:p>
-    <w:p>
-      <w:pPr>
-        <w:pStyle w:val="BodyText"/>
-      </w:pPr>
-      <w:r>
-        <w:t xml:space="preserve">Directorate General of Taxes. (2026b, August 5).</w:t>
+        <w:t xml:space="preserve">[Latest tax from the digital economy: Rp32.32 trillion] (Press Release No. SP-1/2025). Ministry of Finance of the Republic of Indonesia. https://pajak.go.id/id/siaran-pers/pajak-atas-usaha-ekonomi-digital-terkini-3232-triliun</w:t>
+      </w:r>
+    </w:p>
+    <w:p>
+      <w:pPr>
+        <w:pStyle w:val="BodyText"/>
+      </w:pPr>
+      <w:r>
+        <w:t xml:space="preserve">Directorate General of Taxes. (2026a, July 1).</w:t>
       </w:r>
       <w:r>
         <w:t xml:space="preserve"> </w:t>
@@ -18508,13 +18513,37 @@
           <w:iCs/>
           <w:i/>
         </w:rPr>
-        <w:t xml:space="preserve">[Postponement of marketplace collection of income tax Article 22 to 1 November 2026] (PENG-46/PJ.09/2026)</w:t>
+        <w:t xml:space="preserve">Pemerintah implementasikan PMK 37/2025 melalui penunjukan empat marketplace sebagai pemungut PPh</w:t>
       </w:r>
       <w:r>
         <w:t xml:space="preserve"> </w:t>
       </w:r>
       <w:r>
-        <w:t xml:space="preserve">[Announcement]. Ministry of Finance of the Republic of Indonesia. https://pajak.go.id/en/node/120353 [UNVERIFIED: exact title]</w:t>
+        <w:t xml:space="preserve">[Government implements Finance Minister Regulation 37/2025 by designating four marketplaces as income tax collectors] (Press Release No. SP-14/2026). Ministry of Finance of the Republic of Indonesia. https://www.pajak.go.id/en/node/120146</w:t>
+      </w:r>
+    </w:p>
+    <w:p>
+      <w:pPr>
+        <w:pStyle w:val="BodyText"/>
+      </w:pPr>
+      <w:r>
+        <w:t xml:space="preserve">Directorate General of Taxes. (2026b, August 5).</w:t>
+      </w:r>
+      <w:r>
+        <w:t xml:space="preserve"> </w:t>
+      </w:r>
+      <w:r>
+        <w:rPr>
+          <w:iCs/>
+          <w:i/>
+        </w:rPr>
+        <w:t xml:space="preserve">Pengumuman Nomor PENG-46/PJ.09/2026 tentang penundaan waktu pemberlakuan ketentuan pemungutan PPh Pasal 22 oleh marketplace</w:t>
+      </w:r>
+      <w:r>
+        <w:t xml:space="preserve"> </w:t>
+      </w:r>
+      <w:r>
+        <w:t xml:space="preserve">[Announcement No. PENG-46/PJ.09/2026 on postponing marketplace collection of income tax Article 22 to 1 November 2026]. Ministry of Finance of the Republic of Indonesia. https://pajak.go.id/en/node/120353</w:t>
       </w:r>
     </w:p>
     <w:p>
@@ -18546,7 +18575,7 @@
         <w:pStyle w:val="BodyText"/>
       </w:pPr>
       <w:r>
-        <w:t xml:space="preserve">Directorate General of Taxes. (n.d.).</w:t>
+        <w:t xml:space="preserve">European Commission, International Monetary Fund, Organisation for Economic Co-operation and Development, United Nations, &amp; World Bank. (2025).</w:t>
       </w:r>
       <w:r>
         <w:t xml:space="preserve"> </w:t>
@@ -18556,13 +18585,13 @@
           <w:iCs/>
           <w:i/>
         </w:rPr>
-        <w:t xml:space="preserve">Pajak atas usaha ekonomi digital terkini Rp32,32 triliun</w:t>
+        <w:t xml:space="preserve">System of national accounts 2025</w:t>
       </w:r>
       <w:r>
         <w:t xml:space="preserve"> </w:t>
       </w:r>
       <w:r>
-        <w:t xml:space="preserve">[Press release]. Ministry of Finance of the Republic of Indonesia. https://pajak.go.id/id/siaran-pers/pajak-atas-usaha-ekonomi-digital-terkini-3232-triliun [UNVERIFIED: date and title wording; title inferred from URL]</w:t>
+        <w:t xml:space="preserve">(Pre-edit version; Studies in Methods, Series F, No. 2/Rev.6). United Nations. https://doi.org/10.18356/9789211073225</w:t>
       </w:r>
     </w:p>
     <w:p>
@@ -18691,27 +18720,15 @@
         <w:t xml:space="preserve">2023 annual report: Transformation for progress</w:t>
       </w:r>
       <w:r>
-        <w:t xml:space="preserve">. PT GoTo Gojek Tokopedia Tbk. [UNVERIFIED: public URL; local copy</w:t>
-      </w:r>
-      <w:r>
-        <w:t xml:space="preserve"> </w:t>
-      </w:r>
-      <w:r>
-        <w:rPr>
-          <w:rStyle w:val="VerbatimChar"/>
-        </w:rPr>
-        <w:t xml:space="preserve">sources/core_public_documents/goto_annual_report_2023.pdf</w:t>
-      </w:r>
-      <w:r>
-        <w:t xml:space="preserve">]</w:t>
-      </w:r>
-    </w:p>
-    <w:p>
-      <w:pPr>
-        <w:pStyle w:val="BodyText"/>
-      </w:pPr>
-      <w:r>
-        <w:t xml:space="preserve">GoTo Gojek Tokopedia. (2026).</w:t>
+        <w:t xml:space="preserve">. PT GoTo Gojek Tokopedia Tbk. https://content.goinfra.co.id/asts/InvestorRelation/AnnualReport/GOTO_Laporan%20Tahunan_2023.pdf</w:t>
+      </w:r>
+    </w:p>
+    <w:p>
+      <w:pPr>
+        <w:pStyle w:val="BodyText"/>
+      </w:pPr>
+      <w:r>
+        <w:t xml:space="preserve">GoTo Gojek Tokopedia. (2026, July 29).</w:t>
       </w:r>
       <w:r>
         <w:t xml:space="preserve"> </w:t>
@@ -18721,13 +18738,13 @@
           <w:iCs/>
           <w:i/>
         </w:rPr>
-        <w:t xml:space="preserve">Second quarter 2026 earnings call transcript</w:t>
+        <w:t xml:space="preserve">PT GoTo Gojek Tokopedia 2Q26 earnings call transcript</w:t>
       </w:r>
       <w:r>
         <w:t xml:space="preserve"> </w:t>
       </w:r>
       <w:r>
-        <w:t xml:space="preserve">[Transcript]. https://www.gotocompany.com/investor-relations/en/quarterly-results?year=2026&amp;item=Q2 [UNVERIFIED: exact title and date of the call]</w:t>
+        <w:t xml:space="preserve">[Transcript]. https://content.goinfra.co.id/asts/InvestorRelation/FinancialInformation/2026-07-31/PT%20GoTo%20Gojek%20Tokopedia%202Q26%20Earnings%20Call%20Transcript.pdf</w:t>
       </w:r>
     </w:p>
     <w:p>
@@ -18745,13 +18762,13 @@
           <w:iCs/>
           <w:i/>
         </w:rPr>
-        <w:t xml:space="preserve">Peraturan Pemerintah Nomor 20 Tahun 2026 tentang perubahan atas Peraturan Pemerintah Nomor 55 Tahun 2022</w:t>
+        <w:t xml:space="preserve">Peraturan Pemerintah Nomor 20 Tahun 2026 tentang perubahan atas Peraturan Pemerintah Nomor 55 Tahun 2022 tentang penyesuaian pengaturan di bidang pajak penghasilan</w:t>
       </w:r>
       <w:r>
         <w:t xml:space="preserve"> </w:t>
       </w:r>
       <w:r>
-        <w:t xml:space="preserve">[Government Regulation No. 20 of 2026 amending Government Regulation No. 55 of 2022]. https://jdih.setneg.go.id [UNVERIFIED: document-level URL]</w:t>
+        <w:t xml:space="preserve">[Government Regulation No. 20 of 2026 amending Government Regulation No. 55 of 2022 on adjustments to income tax rules]. Lembaran Negara Republik Indonesia Tahun 2026 Nomor 43. https://jdih.kemenkeu.go.id/dok/pp-20-tahun-2026</w:t>
       </w:r>
     </w:p>
     <w:p>
@@ -18769,13 +18786,13 @@
           <w:iCs/>
           <w:i/>
         </w:rPr>
-        <w:t xml:space="preserve">Decree No. 117/2025/ND-CP on tax administration for business activities on e-commerce and digital platforms of households and individuals</w:t>
+        <w:t xml:space="preserve">Nghị định số 117/2025/NĐ-CP quy định quản lý thuế đối với hoạt động kinh doanh trên nền tảng thương mại điện tử, nền tảng số của hộ, cá nhân</w:t>
       </w:r>
       <w:r>
         <w:t xml:space="preserve"> </w:t>
       </w:r>
       <w:r>
-        <w:t xml:space="preserve">[Issued June 9, 2025; effective July 1, 2025]. [UNVERIFIED: primary text not retrieved; English title and details from EY Tax Alert, June 24, 2025, https://taxnews.ey.com/news/2025-1337-vietnam-promulgates-decree-on-tax-administration-for-business-activities-on-e-commerce-and-digital-platforms-of-households-and-individuals]</w:t>
+        <w:t xml:space="preserve">[Decree No. 117/2025/ND-CP on tax administration for business activities on e-commerce and digital platforms of households and individuals; issued June 9, 2025; effective July 1, 2025]. https://datafiles.chinhphu.vn/cpp/files/vbpq/2025/6/117-ndcp.signed.pdf</w:t>
       </w:r>
     </w:p>
     <w:p>
@@ -18799,7 +18816,7 @@
         <w:t xml:space="preserve"> </w:t>
       </w:r>
       <w:r>
-        <w:t xml:space="preserve">[Transcript]. The Motley Fool via AOL. https://www.aol.com/articles/grab-grab-q2-2026-earnings-141515000.html [Third-party transcript; check against Grab’s own webcast before submission]</w:t>
+        <w:t xml:space="preserve">[Transcript]. The Motley Fool via AOL. https://www.aol.com/articles/grab-grab-q2-2026-earnings-141515000.html [Third-party transcript by The Motley Fool, published August 11, 2026]</w:t>
       </w:r>
     </w:p>
     <w:p>
@@ -19105,7 +19122,7 @@
         <w:t xml:space="preserve"> </w:t>
       </w:r>
       <w:r>
-        <w:t xml:space="preserve">[Trade Minister Regulation No. 31 of 2023]. https://jdih.kemendag.go.id [UNVERIFIED: document-level URL]</w:t>
+        <w:t xml:space="preserve">[Trade Minister Regulation No. 31 of 2023 on licensing, advertising, guidance and supervision of businesses in e-commerce]. Berita Negara Republik Indonesia Tahun 2023 Nomor 763. https://jdih.kemendag.go.id/peraturan/peraturan-menteri-perdagangan-nomor-31-tahun-2023-tentang-perizinan-berusaha-periklanan-pembinaan-dan-pengawasan-pelaku-usaha-dalam-perdagangan-melalui-sistem-elektronik-1</w:t>
       </w:r>
     </w:p>
     <w:p>
@@ -19129,7 +19146,7 @@
         <w:t xml:space="preserve"> </w:t>
       </w:r>
       <w:r>
-        <w:t xml:space="preserve">[Trade Minister Regulation No. 19 of 2026]. https://jdih.kemendag.go.id [UNVERIFIED: document-level URL]</w:t>
+        <w:t xml:space="preserve">[Trade Minister Regulation No. 19 of 2026 on conducting e-commerce business]. Berita Negara Republik Indonesia Tahun 2026 Nomor 367. https://jdih.kemendag.go.id/peraturan/peraturan-menteri-perdagangan-republik-indonesia-nomor-19-tahun-2026-tentang-penyelenggaraan-usaha-perdagangan-melalui-sistem-elektronik-1</w:t>
       </w:r>
     </w:p>
     <w:p>
@@ -19150,7 +19167,10 @@
         <w:t xml:space="preserve">Ecommerce in Southeast Asia 2024</w:t>
       </w:r>
       <w:r>
-        <w:t xml:space="preserve">. [UNVERIFIED: primary report not seen; the figure used is quoted by Katadata, July 15, 2024]</w:t>
+        <w:t xml:space="preserve"> </w:t>
+      </w:r>
+      <w:r>
+        <w:t xml:space="preserve">[Report]. https://momentum.asia/insights/detail/ecommerce-in-southeast-asia-2024 [Primary report not seen; figures as quoted in Setyowati (2024)]</w:t>
       </w:r>
     </w:p>
     <w:p>
@@ -19234,7 +19254,7 @@
         <w:t xml:space="preserve">Model reporting rules for digital platforms: International exchange framework and optional module for sale of goods</w:t>
       </w:r>
       <w:r>
-        <w:t xml:space="preserve">. OECD. https://www.oecd.org/tax/exchange-of-tax-information/model-reporting-rules-for-digital-platforms-international-exchange-framework-and-optional-module-for-sale-of-goods.pdf</w:t>
+        <w:t xml:space="preserve">. OECD. https://doi.org/10.1787/8ffb8d09-en</w:t>
       </w:r>
     </w:p>
     <w:p>
@@ -19371,7 +19391,7 @@
         <w:pStyle w:val="BodyText"/>
       </w:pPr>
       <w:r>
-        <w:t xml:space="preserve">Setyowati, D. (2026, May 18). TikTok Shop Tokopedia sesuaikan biaya admin seller per 18 Mei: Ada yang naik [TikTok Shop Tokopedia adjusts seller admin fees from 18 May: some rise].</w:t>
+        <w:t xml:space="preserve">Setyowati, D. (2024, July 15). Transaksi Shopee hingga TikTok Shop Tokopedia di RI Rp 867 triliun [Transactions from Shopee to TikTok Shop Tokopedia in Indonesia reach Rp867 trillion].</w:t>
       </w:r>
       <w:r>
         <w:t xml:space="preserve"> </w:t>
@@ -19384,6 +19404,48 @@
         <w:t xml:space="preserve">Katadata</w:t>
       </w:r>
       <w:r>
+        <w:t xml:space="preserve">. https://katadata.co.id/digital/e-commerce/6694e1bf09ec8/transaksi-shopee-hingga-tiktok-shop-tokopedia-di-ri-rp-867-triliun</w:t>
+      </w:r>
+    </w:p>
+    <w:p>
+      <w:pPr>
+        <w:pStyle w:val="BodyText"/>
+      </w:pPr>
+      <w:r>
+        <w:t xml:space="preserve">Setyowati, D. (2025, June 26). Transaksi belanja online di Indonesia melambat, Thailand dan Malaysia melesat [Online shopping in Indonesia slows while Thailand and Malaysia surge].</w:t>
+      </w:r>
+      <w:r>
+        <w:t xml:space="preserve"> </w:t>
+      </w:r>
+      <w:r>
+        <w:rPr>
+          <w:iCs/>
+          <w:i/>
+        </w:rPr>
+        <w:t xml:space="preserve">Katadata</w:t>
+      </w:r>
+      <w:r>
+        <w:t xml:space="preserve">. https://katadata.co.id/digital/e-commerce/685ba4184c37a/transaksi-belanja-online-di-indonesia-melambat-thailand-dan-malaysia-melesat</w:t>
+      </w:r>
+    </w:p>
+    <w:p>
+      <w:pPr>
+        <w:pStyle w:val="BodyText"/>
+      </w:pPr>
+      <w:r>
+        <w:t xml:space="preserve">Setyowati, D. (2026, May 18). TikTok Shop Tokopedia sesuaikan biaya admin seller per 18 Mei: Ada yang naik [TikTok Shop Tokopedia adjusts seller admin fees from 18 May: some rise].</w:t>
+      </w:r>
+      <w:r>
+        <w:t xml:space="preserve"> </w:t>
+      </w:r>
+      <w:r>
+        <w:rPr>
+          <w:iCs/>
+          <w:i/>
+        </w:rPr>
+        <w:t xml:space="preserve">Katadata</w:t>
+      </w:r>
+      <w:r>
         <w:t xml:space="preserve">. https://katadata.co.id/digital/e-commerce/6a0a8ae3741b3/tiktok-shop-tokopedia-sesuaikan-biaya-admin-seller-per-18-mei-ada-yang-naik</w:t>
       </w:r>
     </w:p>
@@ -19476,7 +19538,7 @@
         <w:pStyle w:val="BodyText"/>
       </w:pPr>
       <w:r>
-        <w:t xml:space="preserve">United Nations et al. (2025).</w:t>
+        <w:t xml:space="preserve">World Bank. (2026).</w:t>
       </w:r>
       <w:r>
         <w:t xml:space="preserve"> </w:t>
@@ -19486,13 +19548,13 @@
           <w:iCs/>
           <w:i/>
         </w:rPr>
-        <w:t xml:space="preserve">System of national accounts 2025</w:t>
+        <w:t xml:space="preserve">World development indicators: Official exchange rate (LCU per US$, period average)</w:t>
       </w:r>
       <w:r>
         <w:t xml:space="preserve"> </w:t>
       </w:r>
       <w:r>
-        <w:t xml:space="preserve">(Studies in Methods, Series F). United Nations. https://doi.org/10.18356/9789211073225 [UNVERIFIED: full list of co-issuing organisations]</w:t>
+        <w:t xml:space="preserve">[PA.NUS.FCRF], Indonesia, 2022–2024. https://data.worldbank.org</w:t>
       </w:r>
     </w:p>
     <w:bookmarkEnd w:id="102"/>

</xml_diff>